<commit_message>
Final PDF Report with all Screenshots
</commit_message>
<xml_diff>
--- a/Report.docx
+++ b/Report.docx
@@ -4,67 +4,971 @@
   <w:body>
     <w:p>
       <w:pPr>
-        <w:spacing w:line="360" w:lineRule="auto"/>
-        <w:jc w:val="both"/>
-        <w:rPr>
-          <w:rFonts w:ascii="Tahoma" w:hAnsi="Tahoma" w:cs="Tahoma"/>
-          <w:b/>
-          <w:sz w:val="24"/>
-          <w:szCs w:val="24"/>
-          <w:u w:val="single"/>
-        </w:rPr>
-      </w:pPr>
-      <w:r>
-        <w:rPr>
-          <w:rFonts w:ascii="Tahoma" w:hAnsi="Tahoma" w:cs="Tahoma"/>
-          <w:b/>
-          <w:sz w:val="24"/>
-          <w:szCs w:val="24"/>
-        </w:rPr>
-        <w:t xml:space="preserve">                     </w:t>
-      </w:r>
-      <w:r>
-        <w:rPr>
-          <w:rFonts w:ascii="Tahoma" w:hAnsi="Tahoma" w:cs="Tahoma"/>
-          <w:b/>
-          <w:sz w:val="24"/>
-          <w:szCs w:val="24"/>
-          <w:u w:val="single"/>
-        </w:rPr>
-        <w:t>FINAL TECHNICAL REPORT: AGRISHARE SL</w:t>
-      </w:r>
-    </w:p>
-    <w:p>
-      <w:pPr>
-        <w:spacing w:line="360" w:lineRule="auto"/>
-        <w:jc w:val="both"/>
-        <w:rPr>
-          <w:rFonts w:ascii="Tahoma" w:hAnsi="Tahoma" w:cs="Tahoma"/>
-          <w:b/>
-          <w:sz w:val="24"/>
-          <w:szCs w:val="24"/>
-          <w:u w:val="single"/>
-        </w:rPr>
-      </w:pPr>
-      <w:r>
-        <w:rPr>
-          <w:rFonts w:ascii="Tahoma" w:hAnsi="Tahoma" w:cs="Tahoma"/>
-          <w:b/>
-          <w:sz w:val="24"/>
-          <w:szCs w:val="24"/>
-          <w:u w:val="single"/>
-        </w:rPr>
-        <w:t xml:space="preserve">Decentralized Agricultural Supply Chain, Logistics Optimization, and </w:t>
-      </w:r>
-      <w:r>
-        <w:rPr>
-          <w:rFonts w:ascii="Tahoma" w:hAnsi="Tahoma" w:cs="Tahoma"/>
-          <w:b/>
-          <w:sz w:val="24"/>
-          <w:szCs w:val="24"/>
-          <w:u w:val="single"/>
-        </w:rPr>
-        <w:t>Escrow System for Sierra Leone</w:t>
+        <w:tabs>
+          <w:tab w:val="left" w:pos="4207"/>
+        </w:tabs>
+        <w:rPr>
+          <w:rFonts w:ascii="Tahoma" w:hAnsi="Tahoma" w:cs="Tahoma"/>
+          <w:b/>
+          <w:sz w:val="24"/>
+          <w:szCs w:val="24"/>
+          <w:u w:val="single"/>
+        </w:rPr>
+      </w:pPr>
+      <w:r>
+        <w:rPr>
+          <w:rFonts w:ascii="Tahoma" w:hAnsi="Tahoma" w:cs="Tahoma"/>
+          <w:b/>
+          <w:sz w:val="24"/>
+          <w:szCs w:val="24"/>
+          <w:u w:val="single"/>
+        </w:rPr>
+        <w:t>TABLE OF CONTENTS</w:t>
+      </w:r>
+    </w:p>
+    <w:p>
+      <w:pPr>
+        <w:pStyle w:val="ListParagraph"/>
+        <w:numPr>
+          <w:ilvl w:val="0"/>
+          <w:numId w:val="10"/>
+        </w:numPr>
+        <w:tabs>
+          <w:tab w:val="left" w:pos="4207"/>
+        </w:tabs>
+        <w:rPr>
+          <w:rFonts w:ascii="Tahoma" w:hAnsi="Tahoma" w:cs="Tahoma"/>
+          <w:sz w:val="24"/>
+          <w:szCs w:val="24"/>
+        </w:rPr>
+      </w:pPr>
+      <w:r>
+        <w:rPr>
+          <w:rFonts w:ascii="Tahoma" w:hAnsi="Tahoma" w:cs="Tahoma"/>
+          <w:sz w:val="24"/>
+          <w:szCs w:val="24"/>
+        </w:rPr>
+        <w:t>Executive Summary……………………………………………………………………………………</w:t>
+      </w:r>
+      <w:r>
+        <w:rPr>
+          <w:rFonts w:ascii="Tahoma" w:hAnsi="Tahoma" w:cs="Tahoma"/>
+          <w:sz w:val="24"/>
+          <w:szCs w:val="24"/>
+        </w:rPr>
+        <w:t>2</w:t>
+      </w:r>
+    </w:p>
+    <w:p>
+      <w:pPr>
+        <w:pStyle w:val="ListParagraph"/>
+        <w:numPr>
+          <w:ilvl w:val="0"/>
+          <w:numId w:val="10"/>
+        </w:numPr>
+        <w:tabs>
+          <w:tab w:val="left" w:pos="4207"/>
+        </w:tabs>
+        <w:rPr>
+          <w:rFonts w:ascii="Tahoma" w:hAnsi="Tahoma" w:cs="Tahoma"/>
+          <w:sz w:val="24"/>
+          <w:szCs w:val="24"/>
+        </w:rPr>
+      </w:pPr>
+      <w:r>
+        <w:rPr>
+          <w:rFonts w:ascii="Tahoma" w:hAnsi="Tahoma" w:cs="Tahoma"/>
+          <w:sz w:val="24"/>
+          <w:szCs w:val="24"/>
+        </w:rPr>
+        <w:t>Problem Statement and System Overview………………………………………………</w:t>
+      </w:r>
+      <w:r>
+        <w:rPr>
+          <w:rFonts w:ascii="Tahoma" w:hAnsi="Tahoma" w:cs="Tahoma"/>
+          <w:sz w:val="24"/>
+          <w:szCs w:val="24"/>
+        </w:rPr>
+        <w:t>..2&amp;3</w:t>
+      </w:r>
+      <w:r>
+        <w:rPr>
+          <w:rFonts w:ascii="Tahoma" w:hAnsi="Tahoma" w:cs="Tahoma"/>
+          <w:sz w:val="24"/>
+          <w:szCs w:val="24"/>
+        </w:rPr>
+        <w:t>.</w:t>
+      </w:r>
+    </w:p>
+    <w:p>
+      <w:pPr>
+        <w:pStyle w:val="ListParagraph"/>
+        <w:tabs>
+          <w:tab w:val="left" w:pos="4207"/>
+        </w:tabs>
+        <w:rPr>
+          <w:rFonts w:ascii="Tahoma" w:hAnsi="Tahoma" w:cs="Tahoma"/>
+          <w:sz w:val="24"/>
+          <w:szCs w:val="24"/>
+        </w:rPr>
+      </w:pPr>
+      <w:r>
+        <w:rPr>
+          <w:rFonts w:ascii="Tahoma" w:hAnsi="Tahoma" w:cs="Tahoma"/>
+          <w:sz w:val="24"/>
+          <w:szCs w:val="24"/>
+        </w:rPr>
+        <w:t>. Project Definition: What is AgriShare SL?</w:t>
+      </w:r>
+    </w:p>
+    <w:p>
+      <w:pPr>
+        <w:pStyle w:val="ListParagraph"/>
+        <w:tabs>
+          <w:tab w:val="left" w:pos="4207"/>
+        </w:tabs>
+        <w:rPr>
+          <w:rFonts w:ascii="Tahoma" w:hAnsi="Tahoma" w:cs="Tahoma"/>
+          <w:sz w:val="24"/>
+          <w:szCs w:val="24"/>
+        </w:rPr>
+      </w:pPr>
+      <w:r>
+        <w:rPr>
+          <w:rFonts w:ascii="Tahoma" w:hAnsi="Tahoma" w:cs="Tahoma"/>
+          <w:sz w:val="24"/>
+          <w:szCs w:val="24"/>
+        </w:rPr>
+        <w:t>. Real Challenges in Sierra Leone</w:t>
+      </w:r>
+    </w:p>
+    <w:p>
+      <w:pPr>
+        <w:pStyle w:val="ListParagraph"/>
+        <w:tabs>
+          <w:tab w:val="left" w:pos="4207"/>
+        </w:tabs>
+        <w:rPr>
+          <w:rFonts w:ascii="Tahoma" w:hAnsi="Tahoma" w:cs="Tahoma"/>
+          <w:sz w:val="24"/>
+          <w:szCs w:val="24"/>
+        </w:rPr>
+      </w:pPr>
+      <w:r>
+        <w:rPr>
+          <w:rFonts w:ascii="Tahoma" w:hAnsi="Tahoma" w:cs="Tahoma"/>
+          <w:sz w:val="24"/>
+          <w:szCs w:val="24"/>
+        </w:rPr>
+        <w:t>. System Solutions and Core Value Propositions</w:t>
+      </w:r>
+    </w:p>
+    <w:p>
+      <w:pPr>
+        <w:pStyle w:val="ListParagraph"/>
+        <w:numPr>
+          <w:ilvl w:val="0"/>
+          <w:numId w:val="10"/>
+        </w:numPr>
+        <w:tabs>
+          <w:tab w:val="left" w:pos="4207"/>
+        </w:tabs>
+        <w:rPr>
+          <w:rFonts w:ascii="Tahoma" w:hAnsi="Tahoma" w:cs="Tahoma"/>
+          <w:sz w:val="24"/>
+          <w:szCs w:val="24"/>
+        </w:rPr>
+      </w:pPr>
+      <w:r>
+        <w:rPr>
+          <w:rFonts w:ascii="Tahoma" w:hAnsi="Tahoma" w:cs="Tahoma"/>
+          <w:sz w:val="24"/>
+          <w:szCs w:val="24"/>
+        </w:rPr>
+        <w:t>System Architecture……………………………………………………………………………………</w:t>
+      </w:r>
+      <w:r>
+        <w:rPr>
+          <w:rFonts w:ascii="Tahoma" w:hAnsi="Tahoma" w:cs="Tahoma"/>
+          <w:sz w:val="24"/>
+          <w:szCs w:val="24"/>
+        </w:rPr>
+        <w:t>5</w:t>
+      </w:r>
+    </w:p>
+    <w:p>
+      <w:pPr>
+        <w:pStyle w:val="ListParagraph"/>
+        <w:tabs>
+          <w:tab w:val="left" w:pos="4207"/>
+        </w:tabs>
+        <w:rPr>
+          <w:rFonts w:ascii="Tahoma" w:hAnsi="Tahoma" w:cs="Tahoma"/>
+          <w:sz w:val="24"/>
+          <w:szCs w:val="24"/>
+        </w:rPr>
+      </w:pPr>
+      <w:r>
+        <w:rPr>
+          <w:rFonts w:ascii="Tahoma" w:hAnsi="Tahoma" w:cs="Tahoma"/>
+          <w:sz w:val="24"/>
+          <w:szCs w:val="24"/>
+        </w:rPr>
+        <w:t>. Three-Tier Architecture Model</w:t>
+      </w:r>
+    </w:p>
+    <w:p>
+      <w:pPr>
+        <w:pStyle w:val="ListParagraph"/>
+        <w:tabs>
+          <w:tab w:val="left" w:pos="4207"/>
+        </w:tabs>
+        <w:rPr>
+          <w:rFonts w:ascii="Tahoma" w:hAnsi="Tahoma" w:cs="Tahoma"/>
+          <w:sz w:val="24"/>
+          <w:szCs w:val="24"/>
+        </w:rPr>
+      </w:pPr>
+      <w:r>
+        <w:rPr>
+          <w:rFonts w:ascii="Tahoma" w:hAnsi="Tahoma" w:cs="Tahoma"/>
+          <w:sz w:val="24"/>
+          <w:szCs w:val="24"/>
+        </w:rPr>
+        <w:t>. Architectural Flow and Layer Separation</w:t>
+      </w:r>
+    </w:p>
+    <w:p>
+      <w:pPr>
+        <w:pStyle w:val="ListParagraph"/>
+        <w:numPr>
+          <w:ilvl w:val="0"/>
+          <w:numId w:val="10"/>
+        </w:numPr>
+        <w:tabs>
+          <w:tab w:val="left" w:pos="4207"/>
+        </w:tabs>
+        <w:rPr>
+          <w:rFonts w:ascii="Tahoma" w:hAnsi="Tahoma" w:cs="Tahoma"/>
+          <w:sz w:val="24"/>
+          <w:szCs w:val="24"/>
+        </w:rPr>
+      </w:pPr>
+      <w:r>
+        <w:rPr>
+          <w:rFonts w:ascii="Tahoma" w:hAnsi="Tahoma" w:cs="Tahoma"/>
+          <w:sz w:val="24"/>
+          <w:szCs w:val="24"/>
+        </w:rPr>
+        <w:t>Figma Interface Design and specifications……………………………………………</w:t>
+      </w:r>
+      <w:r>
+        <w:rPr>
+          <w:rFonts w:ascii="Tahoma" w:hAnsi="Tahoma" w:cs="Tahoma"/>
+          <w:sz w:val="24"/>
+          <w:szCs w:val="24"/>
+        </w:rPr>
+        <w:t>6,7&amp;8</w:t>
+      </w:r>
+    </w:p>
+    <w:p>
+      <w:pPr>
+        <w:pStyle w:val="ListParagraph"/>
+        <w:tabs>
+          <w:tab w:val="left" w:pos="4207"/>
+        </w:tabs>
+        <w:rPr>
+          <w:rFonts w:ascii="Tahoma" w:hAnsi="Tahoma" w:cs="Tahoma"/>
+          <w:sz w:val="24"/>
+          <w:szCs w:val="24"/>
+        </w:rPr>
+      </w:pPr>
+      <w:r>
+        <w:rPr>
+          <w:rFonts w:ascii="Tahoma" w:hAnsi="Tahoma" w:cs="Tahoma"/>
+          <w:sz w:val="24"/>
+          <w:szCs w:val="24"/>
+        </w:rPr>
+        <w:t>.User Interface Design Methodology</w:t>
+      </w:r>
+    </w:p>
+    <w:p>
+      <w:pPr>
+        <w:pStyle w:val="ListParagraph"/>
+        <w:tabs>
+          <w:tab w:val="left" w:pos="4207"/>
+        </w:tabs>
+        <w:rPr>
+          <w:rFonts w:ascii="Tahoma" w:hAnsi="Tahoma" w:cs="Tahoma"/>
+          <w:sz w:val="24"/>
+          <w:szCs w:val="24"/>
+        </w:rPr>
+      </w:pPr>
+      <w:r>
+        <w:rPr>
+          <w:rFonts w:ascii="Tahoma" w:hAnsi="Tahoma" w:cs="Tahoma"/>
+          <w:sz w:val="24"/>
+          <w:szCs w:val="24"/>
+        </w:rPr>
+        <w:t>.Detailed Description of the 10 Figma Screens</w:t>
+      </w:r>
+    </w:p>
+    <w:p>
+      <w:pPr>
+        <w:pStyle w:val="ListParagraph"/>
+        <w:numPr>
+          <w:ilvl w:val="0"/>
+          <w:numId w:val="10"/>
+        </w:numPr>
+        <w:tabs>
+          <w:tab w:val="left" w:pos="4207"/>
+        </w:tabs>
+        <w:rPr>
+          <w:rFonts w:ascii="Tahoma" w:hAnsi="Tahoma" w:cs="Tahoma"/>
+          <w:sz w:val="24"/>
+          <w:szCs w:val="24"/>
+        </w:rPr>
+      </w:pPr>
+      <w:r>
+        <w:rPr>
+          <w:rFonts w:ascii="Tahoma" w:hAnsi="Tahoma" w:cs="Tahoma"/>
+          <w:sz w:val="24"/>
+          <w:szCs w:val="24"/>
+        </w:rPr>
+        <w:t>.UML System Modeling………………………………………………………………………</w:t>
+      </w:r>
+      <w:r>
+        <w:rPr>
+          <w:rFonts w:ascii="Tahoma" w:hAnsi="Tahoma" w:cs="Tahoma"/>
+          <w:sz w:val="24"/>
+          <w:szCs w:val="24"/>
+        </w:rPr>
+        <w:t>9,10&amp;11</w:t>
+      </w:r>
+    </w:p>
+    <w:p>
+      <w:pPr>
+        <w:pStyle w:val="ListParagraph"/>
+        <w:tabs>
+          <w:tab w:val="left" w:pos="4207"/>
+        </w:tabs>
+        <w:rPr>
+          <w:rFonts w:ascii="Tahoma" w:hAnsi="Tahoma" w:cs="Tahoma"/>
+          <w:sz w:val="24"/>
+          <w:szCs w:val="24"/>
+        </w:rPr>
+      </w:pPr>
+      <w:r>
+        <w:rPr>
+          <w:rFonts w:ascii="Tahoma" w:hAnsi="Tahoma" w:cs="Tahoma"/>
+          <w:sz w:val="24"/>
+          <w:szCs w:val="24"/>
+        </w:rPr>
+        <w:t>.Unified Modeling Language (UML) Model Descriptions</w:t>
+      </w:r>
+    </w:p>
+    <w:p>
+      <w:pPr>
+        <w:pStyle w:val="ListParagraph"/>
+        <w:tabs>
+          <w:tab w:val="left" w:pos="4207"/>
+        </w:tabs>
+        <w:rPr>
+          <w:rFonts w:ascii="Tahoma" w:hAnsi="Tahoma" w:cs="Tahoma"/>
+          <w:sz w:val="24"/>
+          <w:szCs w:val="24"/>
+        </w:rPr>
+      </w:pPr>
+      <w:r>
+        <w:rPr>
+          <w:rFonts w:ascii="Tahoma" w:hAnsi="Tahoma" w:cs="Tahoma"/>
+          <w:sz w:val="24"/>
+          <w:szCs w:val="24"/>
+        </w:rPr>
+        <w:t>.UML Use Case Diagrams</w:t>
+      </w:r>
+    </w:p>
+    <w:p>
+      <w:pPr>
+        <w:pStyle w:val="ListParagraph"/>
+        <w:numPr>
+          <w:ilvl w:val="0"/>
+          <w:numId w:val="10"/>
+        </w:numPr>
+        <w:tabs>
+          <w:tab w:val="left" w:pos="4207"/>
+        </w:tabs>
+        <w:rPr>
+          <w:rFonts w:ascii="Tahoma" w:hAnsi="Tahoma" w:cs="Tahoma"/>
+          <w:sz w:val="24"/>
+          <w:szCs w:val="24"/>
+        </w:rPr>
+      </w:pPr>
+      <w:r>
+        <w:rPr>
+          <w:rFonts w:ascii="Tahoma" w:hAnsi="Tahoma" w:cs="Tahoma"/>
+          <w:sz w:val="24"/>
+          <w:szCs w:val="24"/>
+        </w:rPr>
+        <w:t>Strategic Operations and NGO Models………………………………………………………</w:t>
+      </w:r>
+      <w:r>
+        <w:rPr>
+          <w:rFonts w:ascii="Tahoma" w:hAnsi="Tahoma" w:cs="Tahoma"/>
+          <w:sz w:val="24"/>
+          <w:szCs w:val="24"/>
+        </w:rPr>
+        <w:t>13</w:t>
+      </w:r>
+    </w:p>
+    <w:p>
+      <w:pPr>
+        <w:pStyle w:val="ListParagraph"/>
+        <w:tabs>
+          <w:tab w:val="left" w:pos="4207"/>
+        </w:tabs>
+        <w:rPr>
+          <w:rFonts w:ascii="Tahoma" w:hAnsi="Tahoma" w:cs="Tahoma"/>
+          <w:sz w:val="24"/>
+          <w:szCs w:val="24"/>
+        </w:rPr>
+      </w:pPr>
+      <w:r>
+        <w:rPr>
+          <w:rFonts w:ascii="Tahoma" w:hAnsi="Tahoma" w:cs="Tahoma"/>
+          <w:sz w:val="24"/>
+          <w:szCs w:val="24"/>
+        </w:rPr>
+        <w:t>.Re-orienting Intermediares as Platform Value</w:t>
+      </w:r>
+    </w:p>
+    <w:p>
+      <w:pPr>
+        <w:pStyle w:val="ListParagraph"/>
+        <w:tabs>
+          <w:tab w:val="left" w:pos="4207"/>
+        </w:tabs>
+        <w:rPr>
+          <w:rFonts w:ascii="Tahoma" w:hAnsi="Tahoma" w:cs="Tahoma"/>
+          <w:sz w:val="24"/>
+          <w:szCs w:val="24"/>
+        </w:rPr>
+      </w:pPr>
+      <w:r>
+        <w:rPr>
+          <w:rFonts w:ascii="Tahoma" w:hAnsi="Tahoma" w:cs="Tahoma"/>
+          <w:sz w:val="24"/>
+          <w:szCs w:val="24"/>
+        </w:rPr>
+        <w:t>.NGO Zero-Spoilage and Excess Crop Distribution Model</w:t>
+      </w:r>
+    </w:p>
+    <w:p>
+      <w:pPr>
+        <w:pStyle w:val="ListParagraph"/>
+        <w:numPr>
+          <w:ilvl w:val="0"/>
+          <w:numId w:val="10"/>
+        </w:numPr>
+        <w:tabs>
+          <w:tab w:val="left" w:pos="4207"/>
+        </w:tabs>
+        <w:rPr>
+          <w:rFonts w:ascii="Tahoma" w:hAnsi="Tahoma" w:cs="Tahoma"/>
+          <w:b/>
+          <w:sz w:val="24"/>
+          <w:szCs w:val="24"/>
+          <w:u w:val="single"/>
+        </w:rPr>
+      </w:pPr>
+      <w:r>
+        <w:rPr>
+          <w:rFonts w:ascii="Tahoma" w:hAnsi="Tahoma" w:cs="Tahoma"/>
+          <w:sz w:val="24"/>
+          <w:szCs w:val="24"/>
+        </w:rPr>
+        <w:t>Project Management and Timelines…………………………………………………………</w:t>
+      </w:r>
+      <w:r>
+        <w:rPr>
+          <w:rFonts w:ascii="Tahoma" w:hAnsi="Tahoma" w:cs="Tahoma"/>
+          <w:sz w:val="24"/>
+          <w:szCs w:val="24"/>
+        </w:rPr>
+        <w:t>14,15</w:t>
+      </w:r>
+    </w:p>
+    <w:p>
+      <w:pPr>
+        <w:pStyle w:val="ListParagraph"/>
+        <w:tabs>
+          <w:tab w:val="left" w:pos="4207"/>
+        </w:tabs>
+        <w:rPr>
+          <w:rFonts w:ascii="Tahoma" w:hAnsi="Tahoma" w:cs="Tahoma"/>
+          <w:sz w:val="24"/>
+          <w:szCs w:val="24"/>
+        </w:rPr>
+      </w:pPr>
+      <w:r>
+        <w:rPr>
+          <w:rFonts w:ascii="Tahoma" w:hAnsi="Tahoma" w:cs="Tahoma"/>
+          <w:sz w:val="24"/>
+          <w:szCs w:val="24"/>
+        </w:rPr>
+        <w:t>.Agile Project Lifecycle Framework</w:t>
+      </w:r>
+    </w:p>
+    <w:p>
+      <w:pPr>
+        <w:pStyle w:val="ListParagraph"/>
+        <w:tabs>
+          <w:tab w:val="left" w:pos="4207"/>
+        </w:tabs>
+        <w:rPr>
+          <w:rFonts w:ascii="Tahoma" w:hAnsi="Tahoma" w:cs="Tahoma"/>
+          <w:sz w:val="24"/>
+          <w:szCs w:val="24"/>
+        </w:rPr>
+      </w:pPr>
+      <w:r>
+        <w:rPr>
+          <w:rFonts w:ascii="Tahoma" w:hAnsi="Tahoma" w:cs="Tahoma"/>
+          <w:sz w:val="24"/>
+          <w:szCs w:val="24"/>
+        </w:rPr>
+        <w:t>.12-Week Project Timeline and Critical Path Analysis</w:t>
+      </w:r>
+    </w:p>
+    <w:p>
+      <w:pPr>
+        <w:pStyle w:val="ListParagraph"/>
+        <w:numPr>
+          <w:ilvl w:val="0"/>
+          <w:numId w:val="10"/>
+        </w:numPr>
+        <w:tabs>
+          <w:tab w:val="left" w:pos="4207"/>
+        </w:tabs>
+        <w:rPr>
+          <w:rFonts w:ascii="Tahoma" w:hAnsi="Tahoma" w:cs="Tahoma"/>
+          <w:sz w:val="24"/>
+          <w:szCs w:val="24"/>
+        </w:rPr>
+      </w:pPr>
+      <w:r>
+        <w:rPr>
+          <w:rFonts w:ascii="Tahoma" w:hAnsi="Tahoma" w:cs="Tahoma"/>
+          <w:sz w:val="24"/>
+          <w:szCs w:val="24"/>
+        </w:rPr>
+        <w:t>Code Repository, SDLC Metrics and Licensing…………………………</w:t>
+      </w:r>
+      <w:r>
+        <w:rPr>
+          <w:rFonts w:ascii="Tahoma" w:hAnsi="Tahoma" w:cs="Tahoma"/>
+          <w:sz w:val="24"/>
+          <w:szCs w:val="24"/>
+        </w:rPr>
+        <w:t>16,17,18,19&amp;20</w:t>
+      </w:r>
+    </w:p>
+    <w:p>
+      <w:pPr>
+        <w:pStyle w:val="ListParagraph"/>
+        <w:tabs>
+          <w:tab w:val="left" w:pos="4207"/>
+        </w:tabs>
+        <w:rPr>
+          <w:rFonts w:ascii="Tahoma" w:hAnsi="Tahoma" w:cs="Tahoma"/>
+          <w:sz w:val="24"/>
+          <w:szCs w:val="24"/>
+        </w:rPr>
+      </w:pPr>
+      <w:r>
+        <w:rPr>
+          <w:rFonts w:ascii="Tahoma" w:hAnsi="Tahoma" w:cs="Tahoma"/>
+          <w:sz w:val="24"/>
+          <w:szCs w:val="24"/>
+        </w:rPr>
+        <w:t>.Public GITHUB Repository and Collaboration</w:t>
+      </w:r>
+    </w:p>
+    <w:p>
+      <w:pPr>
+        <w:pStyle w:val="ListParagraph"/>
+        <w:tabs>
+          <w:tab w:val="left" w:pos="4207"/>
+        </w:tabs>
+        <w:rPr>
+          <w:rFonts w:ascii="Tahoma" w:hAnsi="Tahoma" w:cs="Tahoma"/>
+          <w:sz w:val="24"/>
+          <w:szCs w:val="24"/>
+        </w:rPr>
+      </w:pPr>
+      <w:r>
+        <w:rPr>
+          <w:rFonts w:ascii="Tahoma" w:hAnsi="Tahoma" w:cs="Tahoma"/>
+          <w:sz w:val="24"/>
+          <w:szCs w:val="24"/>
+        </w:rPr>
+        <w:t>.</w:t>
+      </w:r>
+      <w:r>
+        <w:rPr>
+          <w:rFonts w:ascii="Tahoma" w:hAnsi="Tahoma" w:cs="Tahoma"/>
+          <w:sz w:val="24"/>
+          <w:szCs w:val="24"/>
+        </w:rPr>
+        <w:t>Open-Source Licensing (MIT License</w:t>
+      </w:r>
+      <w:r>
+        <w:rPr>
+          <w:rFonts w:ascii="Tahoma" w:hAnsi="Tahoma" w:cs="Tahoma"/>
+          <w:sz w:val="24"/>
+          <w:szCs w:val="24"/>
+        </w:rPr>
+        <w:t xml:space="preserve"> Framework</w:t>
+      </w:r>
+      <w:r>
+        <w:rPr>
+          <w:rFonts w:ascii="Tahoma" w:hAnsi="Tahoma" w:cs="Tahoma"/>
+          <w:sz w:val="24"/>
+          <w:szCs w:val="24"/>
+        </w:rPr>
+        <w:t>)</w:t>
+      </w:r>
+    </w:p>
+    <w:p>
+      <w:pPr>
+        <w:pStyle w:val="ListParagraph"/>
+        <w:tabs>
+          <w:tab w:val="left" w:pos="4207"/>
+        </w:tabs>
+        <w:rPr>
+          <w:rFonts w:ascii="Tahoma" w:hAnsi="Tahoma" w:cs="Tahoma"/>
+          <w:sz w:val="24"/>
+          <w:szCs w:val="24"/>
+        </w:rPr>
+      </w:pPr>
+      <w:r>
+        <w:rPr>
+          <w:rFonts w:ascii="Tahoma" w:hAnsi="Tahoma" w:cs="Tahoma"/>
+          <w:sz w:val="24"/>
+          <w:szCs w:val="24"/>
+        </w:rPr>
+        <w:t>.Software Development Life Cycle (SDLC) – Agile</w:t>
+      </w:r>
+    </w:p>
+    <w:p>
+      <w:pPr>
+        <w:pStyle w:val="ListParagraph"/>
+        <w:tabs>
+          <w:tab w:val="left" w:pos="4207"/>
+        </w:tabs>
+        <w:rPr>
+          <w:rFonts w:ascii="Tahoma" w:hAnsi="Tahoma" w:cs="Tahoma"/>
+          <w:sz w:val="24"/>
+          <w:szCs w:val="24"/>
+        </w:rPr>
+      </w:pPr>
+      <w:r>
+        <w:rPr>
+          <w:rFonts w:ascii="Tahoma" w:hAnsi="Tahoma" w:cs="Tahoma"/>
+          <w:sz w:val="24"/>
+          <w:szCs w:val="24"/>
+        </w:rPr>
+        <w:t>.UN Sustainable Development Goals (SDG)</w:t>
+      </w:r>
+    </w:p>
+    <w:p>
+      <w:pPr>
+        <w:pStyle w:val="ListParagraph"/>
+        <w:tabs>
+          <w:tab w:val="left" w:pos="4207"/>
+        </w:tabs>
+        <w:rPr>
+          <w:rFonts w:ascii="Tahoma" w:hAnsi="Tahoma" w:cs="Tahoma"/>
+          <w:sz w:val="24"/>
+          <w:szCs w:val="24"/>
+        </w:rPr>
+      </w:pPr>
+      <w:r>
+        <w:rPr>
+          <w:rFonts w:ascii="Tahoma" w:hAnsi="Tahoma" w:cs="Tahoma"/>
+          <w:sz w:val="24"/>
+          <w:szCs w:val="24"/>
+        </w:rPr>
+        <w:t>.System Component Interaction and API Call Flow</w:t>
+      </w:r>
+    </w:p>
+    <w:p>
+      <w:pPr>
+        <w:pStyle w:val="ListParagraph"/>
+        <w:numPr>
+          <w:ilvl w:val="0"/>
+          <w:numId w:val="10"/>
+        </w:numPr>
+        <w:tabs>
+          <w:tab w:val="left" w:pos="4207"/>
+        </w:tabs>
+        <w:rPr>
+          <w:rFonts w:ascii="Tahoma" w:hAnsi="Tahoma" w:cs="Tahoma"/>
+          <w:sz w:val="24"/>
+          <w:szCs w:val="24"/>
+        </w:rPr>
+      </w:pPr>
+      <w:r>
+        <w:rPr>
+          <w:rFonts w:ascii="Tahoma" w:hAnsi="Tahoma" w:cs="Tahoma"/>
+          <w:sz w:val="24"/>
+          <w:szCs w:val="24"/>
+        </w:rPr>
+        <w:t>Conclusion………………………………………………………………………………………………</w:t>
+      </w:r>
+      <w:r>
+        <w:rPr>
+          <w:rFonts w:ascii="Tahoma" w:hAnsi="Tahoma" w:cs="Tahoma"/>
+          <w:sz w:val="24"/>
+          <w:szCs w:val="24"/>
+        </w:rPr>
+        <w:t>21</w:t>
+      </w:r>
+    </w:p>
+    <w:p>
+      <w:pPr>
+        <w:pStyle w:val="ListParagraph"/>
+        <w:tabs>
+          <w:tab w:val="left" w:pos="4207"/>
+        </w:tabs>
+        <w:rPr>
+          <w:rFonts w:ascii="Tahoma" w:hAnsi="Tahoma" w:cs="Tahoma"/>
+          <w:sz w:val="24"/>
+          <w:szCs w:val="24"/>
+        </w:rPr>
+      </w:pPr>
+      <w:r>
+        <w:rPr>
+          <w:rFonts w:ascii="Tahoma" w:hAnsi="Tahoma" w:cs="Tahoma"/>
+          <w:sz w:val="24"/>
+          <w:szCs w:val="24"/>
+        </w:rPr>
+        <w:br w:type="page"/>
+      </w:r>
+      <w:bookmarkStart w:id="0" w:name="_GoBack"/>
+      <w:bookmarkEnd w:id="0"/>
+    </w:p>
+    <w:p>
+      <w:pPr>
+        <w:rPr>
+          <w:rFonts w:ascii="Tahoma" w:hAnsi="Tahoma" w:cs="Tahoma"/>
+          <w:b/>
+          <w:sz w:val="24"/>
+          <w:szCs w:val="24"/>
+          <w:u w:val="single"/>
+        </w:rPr>
+      </w:pPr>
+      <w:r>
+        <w:rPr>
+          <w:rFonts w:ascii="Tahoma" w:hAnsi="Tahoma" w:cs="Tahoma"/>
+          <w:b/>
+          <w:sz w:val="24"/>
+          <w:szCs w:val="24"/>
+          <w:u w:val="single"/>
+        </w:rPr>
+        <w:lastRenderedPageBreak/>
+        <w:t>Project Definition: What is AgriShare-SL?</w:t>
+      </w:r>
+      <w:r>
+        <w:rPr>
+          <w:rFonts w:ascii="Tahoma" w:hAnsi="Tahoma" w:cs="Tahoma"/>
+          <w:b/>
+          <w:sz w:val="24"/>
+          <w:szCs w:val="24"/>
+          <w:u w:val="single"/>
+        </w:rPr>
+        <w:t xml:space="preserve"> </w:t>
+      </w:r>
+    </w:p>
+    <w:p>
+      <w:pPr>
+        <w:rPr>
+          <w:rFonts w:ascii="Tahoma" w:hAnsi="Tahoma" w:cs="Tahoma"/>
+          <w:sz w:val="24"/>
+          <w:szCs w:val="24"/>
+        </w:rPr>
+      </w:pPr>
+      <w:r>
+        <w:rPr>
+          <w:rFonts w:ascii="Tahoma" w:hAnsi="Tahoma" w:cs="Tahoma"/>
+          <w:sz w:val="24"/>
+          <w:szCs w:val="24"/>
+        </w:rPr>
+        <w:t>AgriShare-SL is a decentralized digital platform designed to bridge the gap between rural smallholder farmers and urban buyers in Sierra Leone. The name "AgriShare" represents the core operational model:</w:t>
+      </w:r>
+    </w:p>
+    <w:p>
+      <w:pPr>
+        <w:rPr>
+          <w:rFonts w:ascii="Tahoma" w:hAnsi="Tahoma" w:cs="Tahoma"/>
+          <w:sz w:val="24"/>
+          <w:szCs w:val="24"/>
+        </w:rPr>
+      </w:pPr>
+      <w:r>
+        <w:rPr>
+          <w:rFonts w:ascii="Tahoma" w:hAnsi="Tahoma" w:cs="Tahoma"/>
+          <w:sz w:val="24"/>
+          <w:szCs w:val="24"/>
+        </w:rPr>
+        <w:t>"</w:t>
+      </w:r>
+      <w:proofErr w:type="spellStart"/>
+      <w:r>
+        <w:rPr>
+          <w:rFonts w:ascii="Tahoma" w:hAnsi="Tahoma" w:cs="Tahoma"/>
+          <w:b/>
+          <w:sz w:val="24"/>
+          <w:szCs w:val="24"/>
+        </w:rPr>
+        <w:t>Agri</w:t>
+      </w:r>
+      <w:proofErr w:type="spellEnd"/>
+      <w:r>
+        <w:rPr>
+          <w:rFonts w:ascii="Tahoma" w:hAnsi="Tahoma" w:cs="Tahoma"/>
+          <w:sz w:val="24"/>
+          <w:szCs w:val="24"/>
+        </w:rPr>
+        <w:t>" (Agriculture) and "</w:t>
+      </w:r>
+      <w:r>
+        <w:rPr>
+          <w:rFonts w:ascii="Tahoma" w:hAnsi="Tahoma" w:cs="Tahoma"/>
+          <w:b/>
+          <w:sz w:val="24"/>
+          <w:szCs w:val="24"/>
+        </w:rPr>
+        <w:t>Share</w:t>
+      </w:r>
+      <w:r>
+        <w:rPr>
+          <w:rFonts w:ascii="Tahoma" w:hAnsi="Tahoma" w:cs="Tahoma"/>
+          <w:sz w:val="24"/>
+          <w:szCs w:val="24"/>
+        </w:rPr>
+        <w:t>" (shared logistics/collaborative transport pooling). It is a software solution designed to solve three critical agricultural supply chain failures:</w:t>
+      </w:r>
+    </w:p>
+    <w:p>
+      <w:pPr>
+        <w:pStyle w:val="ListParagraph"/>
+        <w:numPr>
+          <w:ilvl w:val="0"/>
+          <w:numId w:val="6"/>
+        </w:numPr>
+        <w:rPr>
+          <w:rFonts w:ascii="Tahoma" w:hAnsi="Tahoma" w:cs="Tahoma"/>
+          <w:sz w:val="24"/>
+          <w:szCs w:val="24"/>
+        </w:rPr>
+      </w:pPr>
+      <w:r>
+        <w:rPr>
+          <w:rFonts w:ascii="Tahoma" w:hAnsi="Tahoma" w:cs="Tahoma"/>
+          <w:sz w:val="24"/>
+          <w:szCs w:val="24"/>
+        </w:rPr>
+        <w:t>High transport costs through cooperative "Virtual Truck" logistics pooling.</w:t>
+      </w:r>
+    </w:p>
+    <w:p>
+      <w:pPr>
+        <w:pStyle w:val="ListParagraph"/>
+        <w:numPr>
+          <w:ilvl w:val="0"/>
+          <w:numId w:val="6"/>
+        </w:numPr>
+        <w:rPr>
+          <w:rFonts w:ascii="Tahoma" w:hAnsi="Tahoma" w:cs="Tahoma"/>
+          <w:sz w:val="24"/>
+          <w:szCs w:val="24"/>
+        </w:rPr>
+      </w:pPr>
+      <w:r>
+        <w:rPr>
+          <w:rFonts w:ascii="Tahoma" w:hAnsi="Tahoma" w:cs="Tahoma"/>
+          <w:sz w:val="24"/>
+          <w:szCs w:val="24"/>
+        </w:rPr>
+        <w:t>Trust and payment insecurity through a secure Mobile Money Escrow contract.</w:t>
+      </w:r>
+    </w:p>
+    <w:p>
+      <w:pPr>
+        <w:pStyle w:val="ListParagraph"/>
+        <w:numPr>
+          <w:ilvl w:val="0"/>
+          <w:numId w:val="6"/>
+        </w:numPr>
+        <w:rPr>
+          <w:rFonts w:ascii="Tahoma" w:hAnsi="Tahoma" w:cs="Tahoma"/>
+          <w:b/>
+          <w:sz w:val="24"/>
+          <w:szCs w:val="24"/>
+          <w:u w:val="single"/>
+        </w:rPr>
+      </w:pPr>
+      <w:r>
+        <w:rPr>
+          <w:rFonts w:ascii="Tahoma" w:hAnsi="Tahoma" w:cs="Tahoma"/>
+          <w:sz w:val="24"/>
+          <w:szCs w:val="24"/>
+        </w:rPr>
+        <w:t>Post-harvest food waste by connecting farmers directly to transport and urban marketplaces before crops spoil.</w:t>
+      </w:r>
+    </w:p>
+    <w:p>
+      <w:pPr>
+        <w:rPr>
+          <w:rFonts w:ascii="Tahoma" w:hAnsi="Tahoma" w:cs="Tahoma"/>
+          <w:b/>
+          <w:sz w:val="24"/>
+          <w:szCs w:val="24"/>
+          <w:u w:val="single"/>
+        </w:rPr>
+      </w:pPr>
+    </w:p>
+    <w:p>
+      <w:pPr>
+        <w:rPr>
+          <w:rFonts w:ascii="Tahoma" w:hAnsi="Tahoma" w:cs="Tahoma"/>
+          <w:b/>
+          <w:sz w:val="24"/>
+          <w:szCs w:val="24"/>
+          <w:u w:val="single"/>
+        </w:rPr>
+      </w:pPr>
+    </w:p>
+    <w:p>
+      <w:pPr>
+        <w:rPr>
+          <w:rFonts w:ascii="Tahoma" w:hAnsi="Tahoma" w:cs="Tahoma"/>
+          <w:b/>
+          <w:sz w:val="24"/>
+          <w:szCs w:val="24"/>
+          <w:u w:val="single"/>
+        </w:rPr>
+      </w:pPr>
+      <w:r>
+        <w:rPr>
+          <w:rFonts w:ascii="Tahoma" w:hAnsi="Tahoma" w:cs="Tahoma"/>
+          <w:b/>
+          <w:sz w:val="24"/>
+          <w:szCs w:val="24"/>
+          <w:u w:val="single"/>
+        </w:rPr>
+        <w:t>Decentralized Agricultural Supply Chain, Logistics Optimization, and Escrow System for Sierra Leone</w:t>
       </w:r>
     </w:p>
     <w:p>
@@ -241,118 +1145,15 @@
           <w:u w:val="single"/>
         </w:rPr>
       </w:pPr>
-    </w:p>
-    <w:p>
-      <w:pPr>
-        <w:spacing w:line="360" w:lineRule="auto"/>
-        <w:jc w:val="both"/>
-        <w:rPr>
-          <w:rFonts w:ascii="Tahoma" w:hAnsi="Tahoma" w:cs="Tahoma"/>
-          <w:b/>
-          <w:sz w:val="24"/>
-          <w:szCs w:val="24"/>
-          <w:u w:val="single"/>
-        </w:rPr>
-      </w:pPr>
-    </w:p>
-    <w:p>
-      <w:pPr>
-        <w:spacing w:line="360" w:lineRule="auto"/>
-        <w:jc w:val="both"/>
-        <w:rPr>
-          <w:rFonts w:ascii="Tahoma" w:hAnsi="Tahoma" w:cs="Tahoma"/>
-          <w:b/>
-          <w:sz w:val="24"/>
-          <w:szCs w:val="24"/>
-          <w:u w:val="single"/>
-        </w:rPr>
-      </w:pPr>
-    </w:p>
-    <w:p>
-      <w:pPr>
-        <w:spacing w:line="360" w:lineRule="auto"/>
-        <w:jc w:val="both"/>
-        <w:rPr>
-          <w:rFonts w:ascii="Tahoma" w:hAnsi="Tahoma" w:cs="Tahoma"/>
-          <w:b/>
-          <w:sz w:val="24"/>
-          <w:szCs w:val="24"/>
-          <w:u w:val="single"/>
-        </w:rPr>
-      </w:pPr>
-    </w:p>
-    <w:p>
-      <w:pPr>
-        <w:spacing w:line="360" w:lineRule="auto"/>
-        <w:jc w:val="both"/>
-        <w:rPr>
-          <w:rFonts w:ascii="Tahoma" w:hAnsi="Tahoma" w:cs="Tahoma"/>
-          <w:b/>
-          <w:sz w:val="24"/>
-          <w:szCs w:val="24"/>
-          <w:u w:val="single"/>
-        </w:rPr>
-      </w:pPr>
-    </w:p>
-    <w:p>
-      <w:pPr>
-        <w:spacing w:line="360" w:lineRule="auto"/>
-        <w:jc w:val="both"/>
-        <w:rPr>
-          <w:rFonts w:ascii="Tahoma" w:hAnsi="Tahoma" w:cs="Tahoma"/>
-          <w:b/>
-          <w:sz w:val="24"/>
-          <w:szCs w:val="24"/>
-          <w:u w:val="single"/>
-        </w:rPr>
-      </w:pPr>
-    </w:p>
-    <w:p>
-      <w:pPr>
-        <w:spacing w:line="360" w:lineRule="auto"/>
-        <w:jc w:val="both"/>
-        <w:rPr>
-          <w:rFonts w:ascii="Tahoma" w:hAnsi="Tahoma" w:cs="Tahoma"/>
-          <w:b/>
-          <w:sz w:val="24"/>
-          <w:szCs w:val="24"/>
-          <w:u w:val="single"/>
-        </w:rPr>
-      </w:pPr>
-    </w:p>
-    <w:p>
-      <w:pPr>
-        <w:spacing w:line="360" w:lineRule="auto"/>
-        <w:jc w:val="both"/>
-        <w:rPr>
-          <w:rFonts w:ascii="Tahoma" w:hAnsi="Tahoma" w:cs="Tahoma"/>
-          <w:b/>
-          <w:sz w:val="24"/>
-          <w:szCs w:val="24"/>
-          <w:u w:val="single"/>
-        </w:rPr>
-      </w:pPr>
-    </w:p>
-    <w:p>
-      <w:pPr>
-        <w:spacing w:line="360" w:lineRule="auto"/>
-        <w:jc w:val="both"/>
-        <w:rPr>
-          <w:rFonts w:ascii="Tahoma" w:hAnsi="Tahoma" w:cs="Tahoma"/>
-          <w:b/>
-          <w:sz w:val="24"/>
-          <w:szCs w:val="24"/>
-          <w:u w:val="single"/>
-        </w:rPr>
-      </w:pPr>
-      <w:r>
-        <w:rPr>
-          <w:rFonts w:ascii="Tahoma" w:hAnsi="Tahoma" w:cs="Tahoma"/>
-          <w:b/>
-          <w:sz w:val="24"/>
-          <w:szCs w:val="24"/>
-          <w:u w:val="single"/>
-        </w:rPr>
+      <w:r>
+        <w:rPr>
+          <w:rFonts w:ascii="Tahoma" w:hAnsi="Tahoma" w:cs="Tahoma"/>
+          <w:b/>
+          <w:sz w:val="24"/>
+          <w:szCs w:val="24"/>
+          <w:u w:val="single"/>
+        </w:rPr>
+        <w:lastRenderedPageBreak/>
         <w:t>Section 1: Prob</w:t>
       </w:r>
       <w:r>
@@ -508,6 +1309,17 @@
         </w:rPr>
         <w:t xml:space="preserve"> Lack of cash security leads to payment defaults and disputes between farmers, drivers, and buyers.</w:t>
       </w:r>
+    </w:p>
+    <w:p>
+      <w:pPr>
+        <w:spacing w:line="360" w:lineRule="auto"/>
+        <w:jc w:val="both"/>
+        <w:rPr>
+          <w:rFonts w:ascii="Tahoma" w:hAnsi="Tahoma" w:cs="Tahoma"/>
+          <w:sz w:val="24"/>
+          <w:szCs w:val="24"/>
+        </w:rPr>
+      </w:pPr>
     </w:p>
     <w:p>
       <w:pPr>
@@ -1168,7 +1980,7 @@
                     <pic:cNvPicPr/>
                   </pic:nvPicPr>
                   <pic:blipFill>
-                    <a:blip r:embed="rId6">
+                    <a:blip r:embed="rId8">
                       <a:extLst>
                         <a:ext uri="{28A0092B-C50C-407E-A947-70E740481C1C}">
                           <a14:useLocalDpi xmlns:a14="http://schemas.microsoft.com/office/drawing/2010/main" val="0"/>
@@ -2113,7 +2925,7 @@
                     <pic:cNvPicPr/>
                   </pic:nvPicPr>
                   <pic:blipFill>
-                    <a:blip r:embed="rId7" cstate="print">
+                    <a:blip r:embed="rId9" cstate="print">
                       <a:extLst>
                         <a:ext uri="{28A0092B-C50C-407E-A947-70E740481C1C}">
                           <a14:useLocalDpi xmlns:a14="http://schemas.microsoft.com/office/drawing/2010/main" val="0"/>
@@ -2315,45 +3127,343 @@
           <w:szCs w:val="24"/>
           <w:u w:val="single"/>
         </w:rPr>
-        <w:t>Section 4: Database Design</w:t>
-      </w:r>
-    </w:p>
-    <w:p>
-      <w:pPr>
-        <w:spacing w:line="360" w:lineRule="auto"/>
-        <w:jc w:val="both"/>
-        <w:rPr>
-          <w:rFonts w:ascii="Tahoma" w:hAnsi="Tahoma" w:cs="Tahoma"/>
-          <w:sz w:val="24"/>
-          <w:szCs w:val="24"/>
-        </w:rPr>
-      </w:pPr>
-      <w:r>
-        <w:rPr>
-          <w:rFonts w:ascii="Tahoma" w:hAnsi="Tahoma" w:cs="Tahoma"/>
-          <w:sz w:val="24"/>
-          <w:szCs w:val="24"/>
-        </w:rPr>
-        <w:t>To prevent transaction conflicts and secure financial records, AgriShare SL uses a structu</w:t>
-      </w:r>
-      <w:r>
-        <w:rPr>
-          <w:rFonts w:ascii="Tahoma" w:hAnsi="Tahoma" w:cs="Tahoma"/>
-          <w:sz w:val="24"/>
-          <w:szCs w:val="24"/>
-        </w:rPr>
-        <w:t xml:space="preserve">red PostgreSQL database. </w:t>
-      </w:r>
-      <w:proofErr w:type="gramStart"/>
-      <w:r>
-        <w:rPr>
-          <w:rFonts w:ascii="Tahoma" w:hAnsi="Tahoma" w:cs="Tahoma"/>
-          <w:sz w:val="24"/>
-          <w:szCs w:val="24"/>
-        </w:rPr>
-        <w:t>UML Diagrams.</w:t>
-      </w:r>
-      <w:proofErr w:type="gramEnd"/>
+        <w:t>SECTION 4: SYSTEM DESIGN AND UML MODELING</w:t>
+      </w:r>
+    </w:p>
+    <w:p>
+      <w:pPr>
+        <w:spacing w:line="360" w:lineRule="auto"/>
+        <w:jc w:val="both"/>
+        <w:rPr>
+          <w:rFonts w:ascii="Tahoma" w:hAnsi="Tahoma" w:cs="Tahoma"/>
+          <w:sz w:val="24"/>
+          <w:szCs w:val="24"/>
+        </w:rPr>
+      </w:pPr>
+      <w:r>
+        <w:rPr>
+          <w:rFonts w:ascii="Tahoma" w:hAnsi="Tahoma" w:cs="Tahoma"/>
+          <w:sz w:val="24"/>
+          <w:szCs w:val="24"/>
+        </w:rPr>
+        <w:t xml:space="preserve">This section outlines the architectural structure and behavioral flows of the </w:t>
+      </w:r>
+      <w:r>
+        <w:rPr>
+          <w:rFonts w:ascii="Tahoma" w:hAnsi="Tahoma" w:cs="Tahoma"/>
+          <w:sz w:val="24"/>
+          <w:szCs w:val="24"/>
+        </w:rPr>
+        <w:t xml:space="preserve">     </w:t>
+      </w:r>
+      <w:r>
+        <w:rPr>
+          <w:rFonts w:ascii="Tahoma" w:hAnsi="Tahoma" w:cs="Tahoma"/>
+          <w:sz w:val="24"/>
+          <w:szCs w:val="24"/>
+        </w:rPr>
+        <w:t>Agri</w:t>
+      </w:r>
+      <w:r>
+        <w:rPr>
+          <w:rFonts w:ascii="Tahoma" w:hAnsi="Tahoma" w:cs="Tahoma"/>
+          <w:sz w:val="24"/>
+          <w:szCs w:val="24"/>
+        </w:rPr>
+        <w:t xml:space="preserve">Share-SL platform using Unified </w:t>
+      </w:r>
+      <w:r>
+        <w:rPr>
+          <w:rFonts w:ascii="Tahoma" w:hAnsi="Tahoma" w:cs="Tahoma"/>
+          <w:sz w:val="24"/>
+          <w:szCs w:val="24"/>
+        </w:rPr>
+        <w:t>Modeling Language (UML) diagrams. The following descriptions explain the system's actors, static data structures, operational workflows, and real-time message sequences, with the corresponding visual diagrams compi</w:t>
+      </w:r>
+      <w:r>
+        <w:rPr>
+          <w:rFonts w:ascii="Tahoma" w:hAnsi="Tahoma" w:cs="Tahoma"/>
+          <w:sz w:val="24"/>
+          <w:szCs w:val="24"/>
+        </w:rPr>
+        <w:t>led at the end of this section.</w:t>
+      </w:r>
+    </w:p>
+    <w:p>
+      <w:pPr>
+        <w:pStyle w:val="ListParagraph"/>
+        <w:numPr>
+          <w:ilvl w:val="0"/>
+          <w:numId w:val="4"/>
+        </w:numPr>
+        <w:spacing w:line="360" w:lineRule="auto"/>
+        <w:jc w:val="both"/>
+        <w:rPr>
+          <w:rFonts w:ascii="Tahoma" w:hAnsi="Tahoma" w:cs="Tahoma"/>
+          <w:sz w:val="24"/>
+          <w:szCs w:val="24"/>
+        </w:rPr>
+      </w:pPr>
+      <w:r>
+        <w:rPr>
+          <w:rFonts w:ascii="Tahoma" w:hAnsi="Tahoma" w:cs="Tahoma"/>
+          <w:b/>
+          <w:sz w:val="24"/>
+          <w:szCs w:val="24"/>
+          <w:u w:val="single"/>
+        </w:rPr>
+        <w:t>Use Case Diagram:</w:t>
+      </w:r>
+      <w:r>
+        <w:rPr>
+          <w:rFonts w:ascii="Tahoma" w:hAnsi="Tahoma" w:cs="Tahoma"/>
+          <w:sz w:val="24"/>
+          <w:szCs w:val="24"/>
+        </w:rPr>
+        <w:t xml:space="preserve"> Defines the system boundary and illustrates how the primary actors-Farmers, Buyers, Transporters, and Administrators-interact with the core functionalities of the AgriShare-SL platform, such as managing listings, initiating escrow payments, and tracking deliveries.</w:t>
+      </w:r>
+    </w:p>
+    <w:p>
+      <w:pPr>
+        <w:pStyle w:val="ListParagraph"/>
+        <w:spacing w:line="360" w:lineRule="auto"/>
+        <w:ind w:left="801"/>
+        <w:jc w:val="both"/>
+        <w:rPr>
+          <w:rFonts w:ascii="Tahoma" w:hAnsi="Tahoma" w:cs="Tahoma"/>
+          <w:sz w:val="24"/>
+          <w:szCs w:val="24"/>
+        </w:rPr>
+      </w:pPr>
+    </w:p>
+    <w:p>
+      <w:pPr>
+        <w:pStyle w:val="ListParagraph"/>
+        <w:numPr>
+          <w:ilvl w:val="0"/>
+          <w:numId w:val="4"/>
+        </w:numPr>
+        <w:spacing w:line="360" w:lineRule="auto"/>
+        <w:jc w:val="both"/>
+        <w:rPr>
+          <w:rFonts w:ascii="Tahoma" w:hAnsi="Tahoma" w:cs="Tahoma"/>
+          <w:sz w:val="24"/>
+          <w:szCs w:val="24"/>
+        </w:rPr>
+      </w:pPr>
+      <w:r>
+        <w:rPr>
+          <w:rFonts w:ascii="Tahoma" w:hAnsi="Tahoma" w:cs="Tahoma"/>
+          <w:b/>
+          <w:sz w:val="24"/>
+          <w:szCs w:val="24"/>
+          <w:u w:val="single"/>
+        </w:rPr>
+        <w:t>Class Diagram:</w:t>
+      </w:r>
+      <w:r>
+        <w:rPr>
+          <w:rFonts w:ascii="Tahoma" w:hAnsi="Tahoma" w:cs="Tahoma"/>
+          <w:sz w:val="24"/>
+          <w:szCs w:val="24"/>
+        </w:rPr>
+        <w:t xml:space="preserve"> Represents the static database and object structure of the system. It details the core entities (including User, Crop</w:t>
+      </w:r>
+      <w:r>
+        <w:rPr>
+          <w:rFonts w:ascii="Tahoma" w:hAnsi="Tahoma" w:cs="Tahoma"/>
+          <w:sz w:val="24"/>
+          <w:szCs w:val="24"/>
+        </w:rPr>
+        <w:t xml:space="preserve"> </w:t>
+      </w:r>
+      <w:r>
+        <w:rPr>
+          <w:rFonts w:ascii="Tahoma" w:hAnsi="Tahoma" w:cs="Tahoma"/>
+          <w:sz w:val="24"/>
+          <w:szCs w:val="24"/>
+        </w:rPr>
+        <w:t>Listing, Order, Escrow</w:t>
+      </w:r>
+      <w:r>
+        <w:rPr>
+          <w:rFonts w:ascii="Tahoma" w:hAnsi="Tahoma" w:cs="Tahoma"/>
+          <w:sz w:val="24"/>
+          <w:szCs w:val="24"/>
+        </w:rPr>
+        <w:t xml:space="preserve"> </w:t>
+      </w:r>
+      <w:r>
+        <w:rPr>
+          <w:rFonts w:ascii="Tahoma" w:hAnsi="Tahoma" w:cs="Tahoma"/>
+          <w:sz w:val="24"/>
+          <w:szCs w:val="24"/>
+        </w:rPr>
+        <w:t>Contract, and Route), their specific attributes (variables), their operational methods (functions), and the relationships (associations and dependencies) between them.</w:t>
+      </w:r>
+    </w:p>
+    <w:p>
+      <w:pPr>
+        <w:spacing w:line="360" w:lineRule="auto"/>
+        <w:jc w:val="both"/>
+        <w:rPr>
+          <w:rFonts w:ascii="Tahoma" w:hAnsi="Tahoma" w:cs="Tahoma"/>
+          <w:sz w:val="24"/>
+          <w:szCs w:val="24"/>
+        </w:rPr>
+      </w:pPr>
+    </w:p>
+    <w:p>
+      <w:pPr>
+        <w:pStyle w:val="ListParagraph"/>
+        <w:numPr>
+          <w:ilvl w:val="0"/>
+          <w:numId w:val="4"/>
+        </w:numPr>
+        <w:spacing w:line="360" w:lineRule="auto"/>
+        <w:jc w:val="both"/>
+        <w:rPr>
+          <w:rFonts w:ascii="Tahoma" w:hAnsi="Tahoma" w:cs="Tahoma"/>
+          <w:sz w:val="24"/>
+          <w:szCs w:val="24"/>
+        </w:rPr>
+      </w:pPr>
+      <w:r>
+        <w:rPr>
+          <w:rFonts w:ascii="Tahoma" w:hAnsi="Tahoma" w:cs="Tahoma"/>
+          <w:b/>
+          <w:sz w:val="24"/>
+          <w:szCs w:val="24"/>
+          <w:u w:val="single"/>
+        </w:rPr>
+        <w:t>Activity Diagram:</w:t>
+      </w:r>
+      <w:r>
+        <w:rPr>
+          <w:rFonts w:ascii="Tahoma" w:hAnsi="Tahoma" w:cs="Tahoma"/>
+          <w:sz w:val="24"/>
+          <w:szCs w:val="24"/>
+        </w:rPr>
+        <w:t xml:space="preserve"> Illustrates the step-by-step operational workflow of the platform.</w:t>
+      </w:r>
+      <w:r>
+        <w:rPr>
+          <w:rFonts w:ascii="Tahoma" w:hAnsi="Tahoma" w:cs="Tahoma"/>
+          <w:sz w:val="24"/>
+          <w:szCs w:val="24"/>
+        </w:rPr>
+        <w:t xml:space="preserve"> </w:t>
+      </w:r>
+      <w:r>
+        <w:rPr>
+          <w:rFonts w:ascii="Tahoma" w:hAnsi="Tahoma" w:cs="Tahoma"/>
+          <w:sz w:val="24"/>
+          <w:szCs w:val="24"/>
+        </w:rPr>
+        <w:t>It tracks the dynamic flow of activities from the initial crop listing by the farmer, through secure escrow deposit and logistics routing, to final delivery verification and automated payment release.</w:t>
+      </w:r>
+    </w:p>
+    <w:p>
+      <w:pPr>
+        <w:pStyle w:val="ListParagraph"/>
+        <w:rPr>
+          <w:rFonts w:ascii="Tahoma" w:hAnsi="Tahoma" w:cs="Tahoma"/>
+          <w:sz w:val="24"/>
+          <w:szCs w:val="24"/>
+        </w:rPr>
+      </w:pPr>
+    </w:p>
+    <w:p>
+      <w:pPr>
+        <w:pStyle w:val="ListParagraph"/>
+        <w:spacing w:line="360" w:lineRule="auto"/>
+        <w:ind w:left="801"/>
+        <w:jc w:val="both"/>
+        <w:rPr>
+          <w:rFonts w:ascii="Tahoma" w:hAnsi="Tahoma" w:cs="Tahoma"/>
+          <w:sz w:val="24"/>
+          <w:szCs w:val="24"/>
+        </w:rPr>
+      </w:pPr>
+    </w:p>
+    <w:p>
+      <w:pPr>
+        <w:pStyle w:val="ListParagraph"/>
+        <w:numPr>
+          <w:ilvl w:val="0"/>
+          <w:numId w:val="4"/>
+        </w:numPr>
+        <w:spacing w:line="360" w:lineRule="auto"/>
+        <w:jc w:val="both"/>
+        <w:rPr>
+          <w:rFonts w:ascii="Tahoma" w:hAnsi="Tahoma" w:cs="Tahoma"/>
+          <w:sz w:val="24"/>
+          <w:szCs w:val="24"/>
+        </w:rPr>
+      </w:pPr>
+      <w:r>
+        <w:rPr>
+          <w:rFonts w:ascii="Tahoma" w:hAnsi="Tahoma" w:cs="Tahoma"/>
+          <w:b/>
+          <w:sz w:val="24"/>
+          <w:szCs w:val="24"/>
+          <w:u w:val="single"/>
+        </w:rPr>
+        <w:t>Sequence Diagram:</w:t>
+      </w:r>
+      <w:r>
+        <w:rPr>
+          <w:rFonts w:ascii="Tahoma" w:hAnsi="Tahoma" w:cs="Tahoma"/>
+          <w:sz w:val="24"/>
+          <w:szCs w:val="24"/>
+        </w:rPr>
+        <w:t xml:space="preserve"> Details the chronological, step-by-step interaction and message exchanges between key system components (Client </w:t>
+      </w:r>
+      <w:proofErr w:type="spellStart"/>
+      <w:r>
+        <w:rPr>
+          <w:rFonts w:ascii="Tahoma" w:hAnsi="Tahoma" w:cs="Tahoma"/>
+          <w:sz w:val="24"/>
+          <w:szCs w:val="24"/>
+        </w:rPr>
+        <w:t>Ul</w:t>
+      </w:r>
+      <w:proofErr w:type="spellEnd"/>
+      <w:r>
+        <w:rPr>
+          <w:rFonts w:ascii="Tahoma" w:hAnsi="Tahoma" w:cs="Tahoma"/>
+          <w:sz w:val="24"/>
+          <w:szCs w:val="24"/>
+        </w:rPr>
+        <w:t>, Backend API, Database, and Block</w:t>
+      </w:r>
+      <w:r>
+        <w:rPr>
+          <w:rFonts w:ascii="Tahoma" w:hAnsi="Tahoma" w:cs="Tahoma"/>
+          <w:sz w:val="24"/>
+          <w:szCs w:val="24"/>
+        </w:rPr>
+        <w:t>-</w:t>
+      </w:r>
+      <w:r>
+        <w:rPr>
+          <w:rFonts w:ascii="Tahoma" w:hAnsi="Tahoma" w:cs="Tahoma"/>
+          <w:sz w:val="24"/>
+          <w:szCs w:val="24"/>
+        </w:rPr>
+        <w:t>chain Escrow Smart Contract) during a standard crop purchase and delivery transaction lifecycle.</w:t>
+      </w:r>
+    </w:p>
+    <w:p>
+      <w:pPr>
+        <w:spacing w:line="360" w:lineRule="auto"/>
+        <w:jc w:val="both"/>
+        <w:rPr>
+          <w:rFonts w:ascii="Tahoma" w:hAnsi="Tahoma" w:cs="Tahoma"/>
+          <w:sz w:val="24"/>
+          <w:szCs w:val="24"/>
+        </w:rPr>
+      </w:pPr>
     </w:p>
     <w:p>
       <w:pPr>
@@ -2374,8 +3484,8 @@
         </w:rPr>
         <w:drawing>
           <wp:inline distT="0" distB="0" distL="0" distR="0" wp14:anchorId="58AD7D24" wp14:editId="12A6B63B">
-            <wp:extent cx="5943600" cy="2536825"/>
-            <wp:effectExtent l="0" t="0" r="0" b="0"/>
+            <wp:extent cx="6781190" cy="2794407"/>
+            <wp:effectExtent l="0" t="0" r="635" b="6350"/>
             <wp:docPr id="6" name="Picture 6"/>
             <wp:cNvGraphicFramePr>
               <a:graphicFrameLocks xmlns:a="http://schemas.openxmlformats.org/drawingml/2006/main" noChangeAspect="1"/>
@@ -2388,7 +3498,7 @@
                     <pic:cNvPicPr/>
                   </pic:nvPicPr>
                   <pic:blipFill>
-                    <a:blip r:embed="rId8">
+                    <a:blip r:embed="rId10">
                       <a:extLst>
                         <a:ext uri="{28A0092B-C50C-407E-A947-70E740481C1C}">
                           <a14:useLocalDpi xmlns:a14="http://schemas.microsoft.com/office/drawing/2010/main" val="0"/>
@@ -2402,7 +3512,7 @@
                   <pic:spPr>
                     <a:xfrm>
                       <a:off x="0" y="0"/>
-                      <a:ext cx="5943600" cy="2536825"/>
+                      <a:ext cx="6777049" cy="2792701"/>
                     </a:xfrm>
                     <a:prstGeom prst="rect">
                       <a:avLst/>
@@ -2432,7 +3542,6 @@
           <w:sz w:val="24"/>
           <w:szCs w:val="24"/>
         </w:rPr>
-        <w:lastRenderedPageBreak/>
         <w:drawing>
           <wp:inline distT="0" distB="0" distL="0" distR="0">
             <wp:extent cx="5943600" cy="4511040"/>
@@ -2449,7 +3558,7 @@
                     <pic:cNvPicPr/>
                   </pic:nvPicPr>
                   <pic:blipFill>
-                    <a:blip r:embed="rId9">
+                    <a:blip r:embed="rId11">
                       <a:extLst>
                         <a:ext uri="{28A0092B-C50C-407E-A947-70E740481C1C}">
                           <a14:useLocalDpi xmlns:a14="http://schemas.microsoft.com/office/drawing/2010/main" val="0"/>
@@ -2493,6 +3602,7 @@
           <w:sz w:val="24"/>
           <w:szCs w:val="24"/>
         </w:rPr>
+        <w:lastRenderedPageBreak/>
         <w:drawing>
           <wp:inline distT="0" distB="0" distL="0" distR="0">
             <wp:extent cx="6574847" cy="3182112"/>
@@ -2509,7 +3619,7 @@
                     <pic:cNvPicPr/>
                   </pic:nvPicPr>
                   <pic:blipFill>
-                    <a:blip r:embed="rId10">
+                    <a:blip r:embed="rId12">
                       <a:extLst>
                         <a:ext uri="{28A0092B-C50C-407E-A947-70E740481C1C}">
                           <a14:useLocalDpi xmlns:a14="http://schemas.microsoft.com/office/drawing/2010/main" val="0"/>
@@ -2523,7 +3633,7 @@
                   <pic:spPr>
                     <a:xfrm>
                       <a:off x="0" y="0"/>
-                      <a:ext cx="6572481" cy="3180967"/>
+                      <a:ext cx="6574847" cy="3182112"/>
                     </a:xfrm>
                     <a:prstGeom prst="rect">
                       <a:avLst/>
@@ -2546,50 +3656,117 @@
           <w:szCs w:val="24"/>
         </w:rPr>
       </w:pPr>
-      <w:r>
-        <w:rPr>
-          <w:rFonts w:ascii="Tahoma" w:hAnsi="Tahoma" w:cs="Tahoma"/>
+    </w:p>
+    <w:p>
+      <w:pPr>
+        <w:spacing w:line="360" w:lineRule="auto"/>
+        <w:jc w:val="both"/>
+        <w:rPr>
+          <w:rFonts w:ascii="Tahoma" w:hAnsi="Tahoma" w:cs="Tahoma"/>
+          <w:sz w:val="24"/>
+          <w:szCs w:val="24"/>
+        </w:rPr>
+      </w:pPr>
+      <w:r>
+        <w:rPr>
+          <w:rFonts w:ascii="Tahoma" w:hAnsi="Tahoma" w:cs="Tahoma"/>
+          <w:noProof/>
           <w:sz w:val="24"/>
           <w:szCs w:val="24"/>
         </w:rPr>
         <w:lastRenderedPageBreak/>
-        <w:t>Figure 3: UML Database Entity-Relationship Diagram mapping relational tables and keys.</w:t>
-      </w:r>
-      <w:r>
-        <w:rPr>
-          <w:rFonts w:ascii="Tahoma" w:hAnsi="Tahoma" w:cs="Tahoma"/>
-          <w:sz w:val="24"/>
-          <w:szCs w:val="24"/>
-        </w:rPr>
-        <w:t xml:space="preserve"> And UML </w:t>
-      </w:r>
-      <w:proofErr w:type="gramStart"/>
-      <w:r>
-        <w:rPr>
-          <w:rFonts w:ascii="Tahoma" w:hAnsi="Tahoma" w:cs="Tahoma"/>
-          <w:sz w:val="24"/>
-          <w:szCs w:val="24"/>
-        </w:rPr>
-        <w:t>Diagram(</w:t>
-      </w:r>
-      <w:proofErr w:type="gramEnd"/>
-      <w:r>
-        <w:rPr>
-          <w:rFonts w:ascii="Tahoma" w:hAnsi="Tahoma" w:cs="Tahoma"/>
-          <w:sz w:val="24"/>
-          <w:szCs w:val="24"/>
-        </w:rPr>
-        <w:t>Use Case, Class and Sequence)</w:t>
-      </w:r>
-    </w:p>
-    <w:p>
-      <w:pPr>
-        <w:spacing w:line="360" w:lineRule="auto"/>
-        <w:jc w:val="both"/>
-        <w:rPr>
-          <w:rFonts w:ascii="Tahoma" w:hAnsi="Tahoma" w:cs="Tahoma"/>
-          <w:sz w:val="24"/>
-          <w:szCs w:val="24"/>
+        <w:drawing>
+          <wp:inline distT="0" distB="0" distL="0" distR="0">
+            <wp:extent cx="5296205" cy="7395667"/>
+            <wp:effectExtent l="0" t="0" r="0" b="0"/>
+            <wp:docPr id="2" name="Picture 2"/>
+            <wp:cNvGraphicFramePr>
+              <a:graphicFrameLocks xmlns:a="http://schemas.openxmlformats.org/drawingml/2006/main" noChangeAspect="1"/>
+            </wp:cNvGraphicFramePr>
+            <a:graphic xmlns:a="http://schemas.openxmlformats.org/drawingml/2006/main">
+              <a:graphicData uri="http://schemas.openxmlformats.org/drawingml/2006/picture">
+                <pic:pic xmlns:pic="http://schemas.openxmlformats.org/drawingml/2006/picture">
+                  <pic:nvPicPr>
+                    <pic:cNvPr id="0" name="WhatsApp Image 2026-06-30 at 5.32.34 PM.jpeg"/>
+                    <pic:cNvPicPr/>
+                  </pic:nvPicPr>
+                  <pic:blipFill>
+                    <a:blip r:embed="rId13">
+                      <a:extLst>
+                        <a:ext uri="{28A0092B-C50C-407E-A947-70E740481C1C}">
+                          <a14:useLocalDpi xmlns:a14="http://schemas.microsoft.com/office/drawing/2010/main" val="0"/>
+                        </a:ext>
+                      </a:extLst>
+                    </a:blip>
+                    <a:stretch>
+                      <a:fillRect/>
+                    </a:stretch>
+                  </pic:blipFill>
+                  <pic:spPr>
+                    <a:xfrm>
+                      <a:off x="0" y="0"/>
+                      <a:ext cx="5296205" cy="7395667"/>
+                    </a:xfrm>
+                    <a:prstGeom prst="rect">
+                      <a:avLst/>
+                    </a:prstGeom>
+                  </pic:spPr>
+                </pic:pic>
+              </a:graphicData>
+            </a:graphic>
+          </wp:inline>
+        </w:drawing>
+      </w:r>
+    </w:p>
+    <w:p>
+      <w:pPr>
+        <w:spacing w:line="360" w:lineRule="auto"/>
+        <w:jc w:val="both"/>
+        <w:rPr>
+          <w:rFonts w:ascii="Tahoma" w:hAnsi="Tahoma" w:cs="Tahoma"/>
+          <w:b/>
+          <w:sz w:val="24"/>
+          <w:szCs w:val="24"/>
+          <w:u w:val="single"/>
+        </w:rPr>
+      </w:pPr>
+    </w:p>
+    <w:p>
+      <w:pPr>
+        <w:spacing w:line="360" w:lineRule="auto"/>
+        <w:jc w:val="both"/>
+        <w:rPr>
+          <w:rFonts w:ascii="Tahoma" w:hAnsi="Tahoma" w:cs="Tahoma"/>
+          <w:b/>
+          <w:sz w:val="24"/>
+          <w:szCs w:val="24"/>
+          <w:u w:val="single"/>
+        </w:rPr>
+      </w:pPr>
+    </w:p>
+    <w:p>
+      <w:pPr>
+        <w:spacing w:line="360" w:lineRule="auto"/>
+        <w:jc w:val="both"/>
+        <w:rPr>
+          <w:rFonts w:ascii="Tahoma" w:hAnsi="Tahoma" w:cs="Tahoma"/>
+          <w:b/>
+          <w:sz w:val="24"/>
+          <w:szCs w:val="24"/>
+          <w:u w:val="single"/>
+        </w:rPr>
+      </w:pPr>
+    </w:p>
+    <w:p>
+      <w:pPr>
+        <w:spacing w:line="360" w:lineRule="auto"/>
+        <w:jc w:val="both"/>
+        <w:rPr>
+          <w:rFonts w:ascii="Tahoma" w:hAnsi="Tahoma" w:cs="Tahoma"/>
+          <w:b/>
+          <w:sz w:val="24"/>
+          <w:szCs w:val="24"/>
+          <w:u w:val="single"/>
         </w:rPr>
       </w:pPr>
     </w:p>
@@ -3015,7 +4192,7 @@
                     <pic:cNvPicPr/>
                   </pic:nvPicPr>
                   <pic:blipFill>
-                    <a:blip r:embed="rId11">
+                    <a:blip r:embed="rId14">
                       <a:extLst>
                         <a:ext uri="{28A0092B-C50C-407E-A947-70E740481C1C}">
                           <a14:useLocalDpi xmlns:a14="http://schemas.microsoft.com/office/drawing/2010/main" val="0"/>
@@ -3192,7 +4369,7 @@
                     <pic:cNvPicPr/>
                   </pic:nvPicPr>
                   <pic:blipFill>
-                    <a:blip r:embed="rId12">
+                    <a:blip r:embed="rId15">
                       <a:extLst>
                         <a:ext uri="{28A0092B-C50C-407E-A947-70E740481C1C}">
                           <a14:useLocalDpi xmlns:a14="http://schemas.microsoft.com/office/drawing/2010/main" val="0"/>
@@ -3353,6 +4530,7 @@
           <w:szCs w:val="24"/>
           <w:u w:val="single"/>
         </w:rPr>
+        <w:lastRenderedPageBreak/>
         <w:t>Section 7: Code Repo</w:t>
       </w:r>
       <w:r>
@@ -3421,7 +4599,7 @@
         </w:rPr>
         <w:t xml:space="preserve"> </w:t>
       </w:r>
-      <w:hyperlink r:id="rId13" w:history="1">
+      <w:hyperlink r:id="rId16" w:history="1">
         <w:r>
           <w:rPr>
             <w:rFonts w:ascii="Segoe UI" w:eastAsia="Times New Roman" w:hAnsi="Segoe UI" w:cs="Segoe UI"/>
@@ -3441,7 +4619,7 @@
         </w:rPr>
         <w:t>/</w:t>
       </w:r>
-      <w:hyperlink r:id="rId14" w:history="1">
+      <w:hyperlink r:id="rId17" w:history="1">
         <w:r>
           <w:rPr>
             <w:rFonts w:ascii="Segoe UI" w:eastAsia="Times New Roman" w:hAnsi="Segoe UI" w:cs="Segoe UI"/>
@@ -3454,8 +4632,6 @@
           <w:t>AgriShare-SL</w:t>
         </w:r>
       </w:hyperlink>
-      <w:bookmarkStart w:id="0" w:name="_GoBack"/>
-      <w:bookmarkEnd w:id="0"/>
     </w:p>
     <w:p>
       <w:pPr>
@@ -3513,197 +4689,213 @@
     </w:p>
     <w:p>
       <w:pPr>
-        <w:spacing w:line="360" w:lineRule="auto"/>
-        <w:jc w:val="both"/>
-        <w:rPr>
-          <w:rFonts w:ascii="Tahoma" w:hAnsi="Tahoma" w:cs="Tahoma"/>
-          <w:sz w:val="24"/>
-          <w:szCs w:val="24"/>
-        </w:rPr>
-      </w:pPr>
-      <w:r>
-        <w:rPr>
-          <w:rFonts w:ascii="Tahoma" w:hAnsi="Tahoma" w:cs="Tahoma"/>
-          <w:sz w:val="24"/>
-          <w:szCs w:val="24"/>
-        </w:rPr>
-        <w:t>* Permissive Use: Anyone has the right to copy, modify, merge, publish, distribute, and sell the software without paying licensing fees.</w:t>
-      </w:r>
-    </w:p>
-    <w:p>
-      <w:pPr>
-        <w:spacing w:line="360" w:lineRule="auto"/>
-        <w:jc w:val="both"/>
-        <w:rPr>
-          <w:rFonts w:ascii="Tahoma" w:hAnsi="Tahoma" w:cs="Tahoma"/>
-          <w:sz w:val="24"/>
-          <w:szCs w:val="24"/>
-        </w:rPr>
-      </w:pPr>
-      <w:r>
-        <w:rPr>
-          <w:rFonts w:ascii="Tahoma" w:hAnsi="Tahoma" w:cs="Tahoma"/>
-          <w:sz w:val="24"/>
-          <w:szCs w:val="24"/>
-        </w:rPr>
-        <w:t>* Attribution: The only requirement is that the original copyright notice and this permission notice must be included in all copies or substantial portions of the software.</w:t>
-      </w:r>
-    </w:p>
-    <w:p>
-      <w:pPr>
-        <w:spacing w:line="360" w:lineRule="auto"/>
-        <w:jc w:val="both"/>
-        <w:rPr>
-          <w:rFonts w:ascii="Tahoma" w:hAnsi="Tahoma" w:cs="Tahoma"/>
-          <w:sz w:val="24"/>
-          <w:szCs w:val="24"/>
-        </w:rPr>
-      </w:pPr>
-      <w:r>
-        <w:rPr>
-          <w:rFonts w:ascii="Tahoma" w:hAnsi="Tahoma" w:cs="Tahoma"/>
-          <w:sz w:val="24"/>
-          <w:szCs w:val="24"/>
-        </w:rPr>
-        <w:t>* No Liability: The software is provided "as is," without warranty of any kind. The original developers are protected from any legal claims or liability.</w:t>
-      </w:r>
-    </w:p>
-    <w:p>
-      <w:pPr>
-        <w:spacing w:line="360" w:lineRule="auto"/>
-        <w:jc w:val="both"/>
-        <w:rPr>
-          <w:rFonts w:ascii="Tahoma" w:hAnsi="Tahoma" w:cs="Tahoma"/>
-          <w:sz w:val="24"/>
-          <w:szCs w:val="24"/>
-        </w:rPr>
-      </w:pPr>
-    </w:p>
-    <w:p>
-      <w:pPr>
-        <w:spacing w:line="360" w:lineRule="auto"/>
-        <w:jc w:val="both"/>
-        <w:rPr>
-          <w:rFonts w:ascii="Tahoma" w:hAnsi="Tahoma" w:cs="Tahoma"/>
-          <w:sz w:val="24"/>
-          <w:szCs w:val="24"/>
-        </w:rPr>
-      </w:pPr>
-    </w:p>
-    <w:p>
-      <w:pPr>
-        <w:spacing w:line="360" w:lineRule="auto"/>
-        <w:jc w:val="both"/>
-        <w:rPr>
-          <w:rFonts w:ascii="Tahoma" w:hAnsi="Tahoma" w:cs="Tahoma"/>
-          <w:sz w:val="24"/>
-          <w:szCs w:val="24"/>
-        </w:rPr>
-      </w:pPr>
-    </w:p>
-    <w:p>
-      <w:pPr>
-        <w:spacing w:line="360" w:lineRule="auto"/>
-        <w:jc w:val="both"/>
-        <w:rPr>
-          <w:rFonts w:ascii="Tahoma" w:hAnsi="Tahoma" w:cs="Tahoma"/>
-          <w:sz w:val="24"/>
-          <w:szCs w:val="24"/>
-        </w:rPr>
-      </w:pPr>
-    </w:p>
-    <w:p>
-      <w:pPr>
-        <w:spacing w:line="360" w:lineRule="auto"/>
-        <w:jc w:val="both"/>
-        <w:rPr>
-          <w:rFonts w:ascii="Tahoma" w:hAnsi="Tahoma" w:cs="Tahoma"/>
-          <w:sz w:val="24"/>
-          <w:szCs w:val="24"/>
-        </w:rPr>
-      </w:pPr>
-    </w:p>
-    <w:p>
-      <w:pPr>
-        <w:spacing w:line="360" w:lineRule="auto"/>
-        <w:jc w:val="both"/>
-        <w:rPr>
-          <w:rFonts w:ascii="Tahoma" w:hAnsi="Tahoma" w:cs="Tahoma"/>
-          <w:sz w:val="24"/>
-          <w:szCs w:val="24"/>
-        </w:rPr>
-      </w:pPr>
-    </w:p>
-    <w:p>
-      <w:pPr>
-        <w:spacing w:line="360" w:lineRule="auto"/>
-        <w:jc w:val="both"/>
-        <w:rPr>
-          <w:rFonts w:ascii="Tahoma" w:hAnsi="Tahoma" w:cs="Tahoma"/>
-          <w:sz w:val="24"/>
-          <w:szCs w:val="24"/>
-        </w:rPr>
-      </w:pPr>
-    </w:p>
-    <w:p>
-      <w:pPr>
-        <w:spacing w:line="360" w:lineRule="auto"/>
-        <w:jc w:val="both"/>
-        <w:rPr>
-          <w:rFonts w:ascii="Tahoma" w:hAnsi="Tahoma" w:cs="Tahoma"/>
-          <w:sz w:val="24"/>
-          <w:szCs w:val="24"/>
-        </w:rPr>
-      </w:pPr>
-    </w:p>
-    <w:p>
-      <w:pPr>
-        <w:spacing w:line="360" w:lineRule="auto"/>
-        <w:jc w:val="both"/>
-        <w:rPr>
-          <w:rFonts w:ascii="Tahoma" w:hAnsi="Tahoma" w:cs="Tahoma"/>
-          <w:sz w:val="24"/>
-          <w:szCs w:val="24"/>
-        </w:rPr>
-      </w:pPr>
-    </w:p>
-    <w:p>
-      <w:pPr>
-        <w:spacing w:line="360" w:lineRule="auto"/>
-        <w:jc w:val="both"/>
-        <w:rPr>
-          <w:rFonts w:ascii="Tahoma" w:hAnsi="Tahoma" w:cs="Tahoma"/>
-          <w:sz w:val="24"/>
-          <w:szCs w:val="24"/>
-        </w:rPr>
-      </w:pPr>
-    </w:p>
-    <w:p>
-      <w:pPr>
-        <w:spacing w:line="360" w:lineRule="auto"/>
-        <w:jc w:val="both"/>
-        <w:rPr>
-          <w:rFonts w:ascii="Tahoma" w:hAnsi="Tahoma" w:cs="Tahoma"/>
-          <w:sz w:val="24"/>
-          <w:szCs w:val="24"/>
-        </w:rPr>
-      </w:pPr>
-    </w:p>
-    <w:p>
-      <w:pPr>
-        <w:spacing w:line="360" w:lineRule="auto"/>
-        <w:jc w:val="both"/>
-        <w:rPr>
-          <w:rFonts w:ascii="Tahoma" w:hAnsi="Tahoma" w:cs="Tahoma"/>
-          <w:sz w:val="24"/>
-          <w:szCs w:val="24"/>
-        </w:rPr>
-      </w:pPr>
-      <w:r>
-        <w:rPr>
-          <w:rFonts w:ascii="Tahoma" w:hAnsi="Tahoma" w:cs="Tahoma"/>
-          <w:sz w:val="24"/>
-          <w:szCs w:val="24"/>
+        <w:pStyle w:val="ListParagraph"/>
+        <w:numPr>
+          <w:ilvl w:val="0"/>
+          <w:numId w:val="5"/>
+        </w:numPr>
+        <w:spacing w:line="360" w:lineRule="auto"/>
+        <w:jc w:val="both"/>
+        <w:rPr>
+          <w:rFonts w:ascii="Tahoma" w:hAnsi="Tahoma" w:cs="Tahoma"/>
+          <w:sz w:val="24"/>
+          <w:szCs w:val="24"/>
+        </w:rPr>
+      </w:pPr>
+      <w:r>
+        <w:rPr>
+          <w:rFonts w:ascii="Tahoma" w:hAnsi="Tahoma" w:cs="Tahoma"/>
+          <w:b/>
+          <w:sz w:val="24"/>
+          <w:szCs w:val="24"/>
+          <w:u w:val="single"/>
+        </w:rPr>
+        <w:t>Permissive Use:</w:t>
+      </w:r>
+      <w:r>
+        <w:rPr>
+          <w:rFonts w:ascii="Tahoma" w:hAnsi="Tahoma" w:cs="Tahoma"/>
+          <w:sz w:val="24"/>
+          <w:szCs w:val="24"/>
+        </w:rPr>
+        <w:t xml:space="preserve"> Anyone has the right to copy, modify, merge, publish, distribute, and sell the software without paying licensing fees.</w:t>
+      </w:r>
+    </w:p>
+    <w:p>
+      <w:pPr>
+        <w:pStyle w:val="ListParagraph"/>
+        <w:numPr>
+          <w:ilvl w:val="0"/>
+          <w:numId w:val="5"/>
+        </w:numPr>
+        <w:spacing w:line="360" w:lineRule="auto"/>
+        <w:jc w:val="both"/>
+        <w:rPr>
+          <w:rFonts w:ascii="Tahoma" w:hAnsi="Tahoma" w:cs="Tahoma"/>
+          <w:sz w:val="24"/>
+          <w:szCs w:val="24"/>
+        </w:rPr>
+      </w:pPr>
+      <w:r>
+        <w:rPr>
+          <w:rFonts w:ascii="Tahoma" w:hAnsi="Tahoma" w:cs="Tahoma"/>
+          <w:b/>
+          <w:sz w:val="24"/>
+          <w:szCs w:val="24"/>
+          <w:u w:val="single"/>
+        </w:rPr>
+        <w:t>Attribution:</w:t>
+      </w:r>
+      <w:r>
+        <w:rPr>
+          <w:rFonts w:ascii="Tahoma" w:hAnsi="Tahoma" w:cs="Tahoma"/>
+          <w:sz w:val="24"/>
+          <w:szCs w:val="24"/>
+        </w:rPr>
+        <w:t xml:space="preserve"> The only requirement is that the original copyright notice and this permission notice must be included in all copies or substantial portions of the software.</w:t>
+      </w:r>
+    </w:p>
+    <w:p>
+      <w:pPr>
+        <w:pStyle w:val="ListParagraph"/>
+        <w:numPr>
+          <w:ilvl w:val="0"/>
+          <w:numId w:val="5"/>
+        </w:numPr>
+        <w:spacing w:line="360" w:lineRule="auto"/>
+        <w:jc w:val="both"/>
+        <w:rPr>
+          <w:rFonts w:ascii="Tahoma" w:hAnsi="Tahoma" w:cs="Tahoma"/>
+          <w:sz w:val="24"/>
+          <w:szCs w:val="24"/>
+        </w:rPr>
+      </w:pPr>
+      <w:r>
+        <w:rPr>
+          <w:rFonts w:ascii="Tahoma" w:hAnsi="Tahoma" w:cs="Tahoma"/>
+          <w:b/>
+          <w:sz w:val="24"/>
+          <w:szCs w:val="24"/>
+          <w:u w:val="single"/>
+        </w:rPr>
+        <w:t>No Liability:</w:t>
+      </w:r>
+      <w:r>
+        <w:rPr>
+          <w:rFonts w:ascii="Tahoma" w:hAnsi="Tahoma" w:cs="Tahoma"/>
+          <w:sz w:val="24"/>
+          <w:szCs w:val="24"/>
+        </w:rPr>
+        <w:t xml:space="preserve"> The software is provided "as is," without warranty of any kind. The original developers are protected from any legal claims or liability.</w:t>
+      </w:r>
+    </w:p>
+    <w:p>
+      <w:pPr>
+        <w:spacing w:line="360" w:lineRule="auto"/>
+        <w:jc w:val="both"/>
+        <w:rPr>
+          <w:rFonts w:ascii="Tahoma" w:hAnsi="Tahoma" w:cs="Tahoma"/>
+          <w:sz w:val="24"/>
+          <w:szCs w:val="24"/>
+        </w:rPr>
+      </w:pPr>
+    </w:p>
+    <w:p>
+      <w:pPr>
+        <w:spacing w:line="360" w:lineRule="auto"/>
+        <w:jc w:val="both"/>
+        <w:rPr>
+          <w:rFonts w:ascii="Tahoma" w:hAnsi="Tahoma" w:cs="Tahoma"/>
+          <w:sz w:val="24"/>
+          <w:szCs w:val="24"/>
+        </w:rPr>
+      </w:pPr>
+    </w:p>
+    <w:p>
+      <w:pPr>
+        <w:spacing w:line="360" w:lineRule="auto"/>
+        <w:jc w:val="both"/>
+        <w:rPr>
+          <w:rFonts w:ascii="Tahoma" w:hAnsi="Tahoma" w:cs="Tahoma"/>
+          <w:sz w:val="24"/>
+          <w:szCs w:val="24"/>
+        </w:rPr>
+      </w:pPr>
+    </w:p>
+    <w:p>
+      <w:pPr>
+        <w:spacing w:line="360" w:lineRule="auto"/>
+        <w:jc w:val="both"/>
+        <w:rPr>
+          <w:rFonts w:ascii="Tahoma" w:hAnsi="Tahoma" w:cs="Tahoma"/>
+          <w:sz w:val="24"/>
+          <w:szCs w:val="24"/>
+        </w:rPr>
+      </w:pPr>
+    </w:p>
+    <w:p>
+      <w:pPr>
+        <w:spacing w:line="360" w:lineRule="auto"/>
+        <w:jc w:val="both"/>
+        <w:rPr>
+          <w:rFonts w:ascii="Tahoma" w:hAnsi="Tahoma" w:cs="Tahoma"/>
+          <w:sz w:val="24"/>
+          <w:szCs w:val="24"/>
+        </w:rPr>
+      </w:pPr>
+    </w:p>
+    <w:p>
+      <w:pPr>
+        <w:spacing w:line="360" w:lineRule="auto"/>
+        <w:jc w:val="both"/>
+        <w:rPr>
+          <w:rFonts w:ascii="Tahoma" w:hAnsi="Tahoma" w:cs="Tahoma"/>
+          <w:sz w:val="24"/>
+          <w:szCs w:val="24"/>
+        </w:rPr>
+      </w:pPr>
+    </w:p>
+    <w:p>
+      <w:pPr>
+        <w:spacing w:line="360" w:lineRule="auto"/>
+        <w:jc w:val="both"/>
+        <w:rPr>
+          <w:rFonts w:ascii="Tahoma" w:hAnsi="Tahoma" w:cs="Tahoma"/>
+          <w:sz w:val="24"/>
+          <w:szCs w:val="24"/>
+        </w:rPr>
+      </w:pPr>
+    </w:p>
+    <w:p>
+      <w:pPr>
+        <w:spacing w:line="360" w:lineRule="auto"/>
+        <w:jc w:val="both"/>
+        <w:rPr>
+          <w:rFonts w:ascii="Tahoma" w:hAnsi="Tahoma" w:cs="Tahoma"/>
+          <w:sz w:val="24"/>
+          <w:szCs w:val="24"/>
+        </w:rPr>
+      </w:pPr>
+    </w:p>
+    <w:p>
+      <w:pPr>
+        <w:spacing w:line="360" w:lineRule="auto"/>
+        <w:jc w:val="both"/>
+        <w:rPr>
+          <w:rFonts w:ascii="Tahoma" w:hAnsi="Tahoma" w:cs="Tahoma"/>
+          <w:b/>
+          <w:sz w:val="24"/>
+          <w:szCs w:val="24"/>
+          <w:u w:val="single"/>
+        </w:rPr>
+      </w:pPr>
+      <w:r>
+        <w:rPr>
+          <w:rFonts w:ascii="Tahoma" w:hAnsi="Tahoma" w:cs="Tahoma"/>
+          <w:b/>
+          <w:sz w:val="24"/>
+          <w:szCs w:val="24"/>
+          <w:u w:val="single"/>
         </w:rPr>
         <w:t>Software Development Life Cycle (SDLC) - Agile Model</w:t>
       </w:r>
@@ -3778,113 +4970,152 @@
           <w:szCs w:val="24"/>
           <w:u w:val="single"/>
         </w:rPr>
-        <w:t>Agile Phases for Agric</w:t>
-      </w:r>
-      <w:r>
-        <w:rPr>
-          <w:rFonts w:ascii="Tahoma" w:hAnsi="Tahoma" w:cs="Tahoma"/>
-          <w:b/>
-          <w:sz w:val="24"/>
-          <w:szCs w:val="24"/>
-          <w:u w:val="single"/>
-        </w:rPr>
-        <w:t>Share SL:</w:t>
-      </w:r>
-    </w:p>
-    <w:p>
-      <w:pPr>
-        <w:spacing w:line="360" w:lineRule="auto"/>
-        <w:jc w:val="both"/>
-        <w:rPr>
-          <w:rFonts w:ascii="Tahoma" w:hAnsi="Tahoma" w:cs="Tahoma"/>
-          <w:sz w:val="24"/>
-          <w:szCs w:val="24"/>
-        </w:rPr>
-      </w:pPr>
-      <w:r>
-        <w:rPr>
-          <w:rFonts w:ascii="Tahoma" w:hAnsi="Tahoma" w:cs="Tahoma"/>
-          <w:sz w:val="24"/>
-          <w:szCs w:val="24"/>
-        </w:rPr>
-        <w:t>1. Requirements Gathering: We analyzed the challenges of rural farmers and buyers in Freetown. We identified key constraints: high transportation costs, middleman exploitation, low digital literacy, and internet connectivity issues.</w:t>
-      </w:r>
-    </w:p>
-    <w:p>
-      <w:pPr>
-        <w:spacing w:line="360" w:lineRule="auto"/>
-        <w:jc w:val="both"/>
-        <w:rPr>
-          <w:rFonts w:ascii="Tahoma" w:hAnsi="Tahoma" w:cs="Tahoma"/>
-          <w:sz w:val="24"/>
-          <w:szCs w:val="24"/>
-        </w:rPr>
-      </w:pPr>
-      <w:r>
-        <w:rPr>
-          <w:rFonts w:ascii="Tahoma" w:hAnsi="Tahoma" w:cs="Tahoma"/>
-          <w:sz w:val="24"/>
-          <w:szCs w:val="24"/>
-        </w:rPr>
-        <w:t>2. System Design: We designed the database schema to support shared transportation (aggregation) and mapped out the three-tier system architecture. We selected Orange Money and Afrimoney for payment integrations.</w:t>
-      </w:r>
-    </w:p>
-    <w:p>
-      <w:pPr>
-        <w:spacing w:line="360" w:lineRule="auto"/>
-        <w:jc w:val="both"/>
-        <w:rPr>
-          <w:rFonts w:ascii="Tahoma" w:hAnsi="Tahoma" w:cs="Tahoma"/>
-          <w:sz w:val="24"/>
-          <w:szCs w:val="24"/>
-        </w:rPr>
-      </w:pPr>
-      <w:r>
-        <w:rPr>
-          <w:rFonts w:ascii="Tahoma" w:hAnsi="Tahoma" w:cs="Tahoma"/>
-          <w:sz w:val="24"/>
-          <w:szCs w:val="24"/>
-        </w:rPr>
-        <w:t>3. UI/UX Prototyping: We designed the 10-screen user flow in Figma. Based on early feedback, we added Krio voice notes to assist semi-literate farmers and a 'Virtual Truck' progress bar to show shared shipping status.</w:t>
-      </w:r>
-    </w:p>
-    <w:p>
-      <w:pPr>
-        <w:spacing w:line="360" w:lineRule="auto"/>
-        <w:jc w:val="both"/>
-        <w:rPr>
-          <w:rFonts w:ascii="Tahoma" w:hAnsi="Tahoma" w:cs="Tahoma"/>
-          <w:sz w:val="24"/>
-          <w:szCs w:val="24"/>
-        </w:rPr>
-      </w:pPr>
-      <w:r>
-        <w:rPr>
-          <w:rFonts w:ascii="Tahoma" w:hAnsi="Tahoma" w:cs="Tahoma"/>
-          <w:sz w:val="24"/>
-          <w:szCs w:val="24"/>
-        </w:rPr>
-        <w:t>4. Integration &amp; Testing: We modeled the escrow system logic, ensuring money is held safely until the driver's QR code is scanned upon delivery.</w:t>
-      </w:r>
-    </w:p>
-    <w:p>
-      <w:pPr>
-        <w:spacing w:line="360" w:lineRule="auto"/>
-        <w:jc w:val="both"/>
-        <w:rPr>
-          <w:rFonts w:ascii="Tahoma" w:hAnsi="Tahoma" w:cs="Tahoma"/>
-          <w:sz w:val="24"/>
-          <w:szCs w:val="24"/>
-        </w:rPr>
-      </w:pPr>
-      <w:r>
-        <w:rPr>
-          <w:rFonts w:ascii="Tahoma" w:hAnsi="Tahoma" w:cs="Tahoma"/>
-          <w:sz w:val="24"/>
-          <w:szCs w:val="24"/>
-        </w:rPr>
-        <w:lastRenderedPageBreak/>
-        <w:t>5. Review &amp; Handoff: The system was packaged, the repository was initialized on GitHub, and the documentation was finalized for university submission.</w:t>
+        <w:t>Agile Phases for AgricShare SL:</w:t>
+      </w:r>
+    </w:p>
+    <w:p>
+      <w:pPr>
+        <w:spacing w:line="360" w:lineRule="auto"/>
+        <w:jc w:val="both"/>
+        <w:rPr>
+          <w:rFonts w:ascii="Tahoma" w:hAnsi="Tahoma" w:cs="Tahoma"/>
+          <w:sz w:val="24"/>
+          <w:szCs w:val="24"/>
+        </w:rPr>
+      </w:pPr>
+      <w:r>
+        <w:rPr>
+          <w:rFonts w:ascii="Tahoma" w:hAnsi="Tahoma" w:cs="Tahoma"/>
+          <w:b/>
+          <w:sz w:val="24"/>
+          <w:szCs w:val="24"/>
+          <w:u w:val="single"/>
+        </w:rPr>
+        <w:t>1. Requirements Gathering:</w:t>
+      </w:r>
+      <w:r>
+        <w:rPr>
+          <w:rFonts w:ascii="Tahoma" w:hAnsi="Tahoma" w:cs="Tahoma"/>
+          <w:sz w:val="24"/>
+          <w:szCs w:val="24"/>
+        </w:rPr>
+        <w:t xml:space="preserve"> We analyzed the challenges of rural farmers and buyers in Freetown. We identified key constraints: high transportation costs, middleman exploitation, low digital literacy, and internet connectivity issues.</w:t>
+      </w:r>
+    </w:p>
+    <w:p>
+      <w:pPr>
+        <w:spacing w:line="360" w:lineRule="auto"/>
+        <w:jc w:val="both"/>
+        <w:rPr>
+          <w:rFonts w:ascii="Tahoma" w:hAnsi="Tahoma" w:cs="Tahoma"/>
+          <w:sz w:val="24"/>
+          <w:szCs w:val="24"/>
+        </w:rPr>
+      </w:pPr>
+      <w:r>
+        <w:rPr>
+          <w:rFonts w:ascii="Tahoma" w:hAnsi="Tahoma" w:cs="Tahoma"/>
+          <w:b/>
+          <w:sz w:val="24"/>
+          <w:szCs w:val="24"/>
+          <w:u w:val="single"/>
+        </w:rPr>
+        <w:t>2. System Design:</w:t>
+      </w:r>
+      <w:r>
+        <w:rPr>
+          <w:rFonts w:ascii="Tahoma" w:hAnsi="Tahoma" w:cs="Tahoma"/>
+          <w:sz w:val="24"/>
+          <w:szCs w:val="24"/>
+        </w:rPr>
+        <w:t xml:space="preserve"> We designed the database schema to support shared transportation (aggregation) and mapped out the three-tier system architecture. We selected Orange Money and Afrimoney for payment integrations.</w:t>
+      </w:r>
+    </w:p>
+    <w:p>
+      <w:pPr>
+        <w:spacing w:line="360" w:lineRule="auto"/>
+        <w:jc w:val="both"/>
+        <w:rPr>
+          <w:rFonts w:ascii="Tahoma" w:hAnsi="Tahoma" w:cs="Tahoma"/>
+          <w:sz w:val="24"/>
+          <w:szCs w:val="24"/>
+        </w:rPr>
+      </w:pPr>
+      <w:r>
+        <w:rPr>
+          <w:rFonts w:ascii="Tahoma" w:hAnsi="Tahoma" w:cs="Tahoma"/>
+          <w:b/>
+          <w:sz w:val="24"/>
+          <w:szCs w:val="24"/>
+          <w:u w:val="single"/>
+        </w:rPr>
+        <w:t>3. UI/UX Prototyping:</w:t>
+      </w:r>
+      <w:r>
+        <w:rPr>
+          <w:rFonts w:ascii="Tahoma" w:hAnsi="Tahoma" w:cs="Tahoma"/>
+          <w:sz w:val="24"/>
+          <w:szCs w:val="24"/>
+        </w:rPr>
+        <w:t xml:space="preserve"> We designed the 10-screen user flow in Figma. Based on early feedback, we added Krio voice notes to assist semi-literate farmers and a 'Virtual Truck' progress bar to show shared shipping status.</w:t>
+      </w:r>
+    </w:p>
+    <w:p>
+      <w:pPr>
+        <w:spacing w:line="360" w:lineRule="auto"/>
+        <w:jc w:val="both"/>
+        <w:rPr>
+          <w:rFonts w:ascii="Tahoma" w:hAnsi="Tahoma" w:cs="Tahoma"/>
+          <w:sz w:val="24"/>
+          <w:szCs w:val="24"/>
+        </w:rPr>
+      </w:pPr>
+      <w:r>
+        <w:rPr>
+          <w:rFonts w:ascii="Tahoma" w:hAnsi="Tahoma" w:cs="Tahoma"/>
+          <w:b/>
+          <w:sz w:val="24"/>
+          <w:szCs w:val="24"/>
+          <w:u w:val="single"/>
+        </w:rPr>
+        <w:t>4. Integration &amp; Testing:</w:t>
+      </w:r>
+      <w:r>
+        <w:rPr>
+          <w:rFonts w:ascii="Tahoma" w:hAnsi="Tahoma" w:cs="Tahoma"/>
+          <w:sz w:val="24"/>
+          <w:szCs w:val="24"/>
+        </w:rPr>
+        <w:t xml:space="preserve"> We modeled the escrow system logic, ensuring money is held safely until the driver's QR code is scanned upon delivery.</w:t>
+      </w:r>
+    </w:p>
+    <w:p>
+      <w:pPr>
+        <w:spacing w:line="360" w:lineRule="auto"/>
+        <w:jc w:val="both"/>
+        <w:rPr>
+          <w:rFonts w:ascii="Tahoma" w:hAnsi="Tahoma" w:cs="Tahoma"/>
+          <w:sz w:val="24"/>
+          <w:szCs w:val="24"/>
+        </w:rPr>
+      </w:pPr>
+      <w:r>
+        <w:rPr>
+          <w:rFonts w:ascii="Tahoma" w:hAnsi="Tahoma" w:cs="Tahoma"/>
+          <w:b/>
+          <w:sz w:val="24"/>
+          <w:szCs w:val="24"/>
+          <w:u w:val="single"/>
+        </w:rPr>
+        <w:t>5. Review &amp; Handoff:</w:t>
+      </w:r>
+      <w:r>
+        <w:rPr>
+          <w:rFonts w:ascii="Tahoma" w:hAnsi="Tahoma" w:cs="Tahoma"/>
+          <w:sz w:val="24"/>
+          <w:szCs w:val="24"/>
+        </w:rPr>
+        <w:t xml:space="preserve"> The system was packaged, the repository was initialized on GitHub, and the documentation was finalized for university submission.</w:t>
       </w:r>
     </w:p>
     <w:p>
@@ -3964,7 +5195,7 @@
             <wp:cNvGraphicFramePr/>
             <a:graphic xmlns:a="http://schemas.openxmlformats.org/drawingml/2006/main">
               <a:graphicData uri="http://schemas.openxmlformats.org/drawingml/2006/diagram">
-                <dgm:relIds xmlns:dgm="http://schemas.openxmlformats.org/drawingml/2006/diagram" xmlns:r="http://schemas.openxmlformats.org/officeDocument/2006/relationships" r:dm="rId15" r:lo="rId16" r:qs="rId17" r:cs="rId18"/>
+                <dgm:relIds xmlns:dgm="http://schemas.openxmlformats.org/drawingml/2006/diagram" xmlns:r="http://schemas.openxmlformats.org/officeDocument/2006/relationships" r:dm="rId18" r:lo="rId19" r:qs="rId20" r:cs="rId21"/>
               </a:graphicData>
             </a:graphic>
           </wp:inline>
@@ -4677,16 +5908,7 @@
           <w:sz w:val="24"/>
           <w:szCs w:val="24"/>
         </w:rPr>
-        <w:t xml:space="preserve">AgriShare SL addresses key structural inefficiencies in Sierra Leone's agricultural supply </w:t>
-      </w:r>
-      <w:proofErr w:type="gramStart"/>
-      <w:r>
-        <w:rPr>
-          <w:rFonts w:ascii="Tahoma" w:hAnsi="Tahoma" w:cs="Tahoma"/>
-          <w:sz w:val="24"/>
-          <w:szCs w:val="24"/>
-        </w:rPr>
-        <w:t>chain</w:t>
+        <w:t>AgriShare SL addresses key structural inefficiencies in Sierra Leone's agricultural supply chain</w:t>
       </w:r>
       <w:r>
         <w:rPr>
@@ -4696,7 +5918,6 @@
         </w:rPr>
         <w:t>s</w:t>
       </w:r>
-      <w:proofErr w:type="gramEnd"/>
       <w:r>
         <w:rPr>
           <w:rFonts w:ascii="Tahoma" w:hAnsi="Tahoma" w:cs="Tahoma"/>
@@ -4707,6 +5928,7 @@
       </w:r>
     </w:p>
     <w:sectPr>
+      <w:footerReference w:type="default" r:id="rId23"/>
       <w:pgSz w:w="12240" w:h="15840"/>
       <w:pgMar w:top="1440" w:right="1440" w:bottom="1440" w:left="1440" w:header="720" w:footer="720" w:gutter="0"/>
       <w:cols w:space="720"/>
@@ -4716,9 +5938,224 @@
 </w:document>
 </file>
 
+<file path=word/endnotes.xml><?xml version="1.0" encoding="utf-8"?>
+<w:endnotes xmlns:wpc="http://schemas.microsoft.com/office/word/2010/wordprocessingCanvas" xmlns:mc="http://schemas.openxmlformats.org/markup-compatibility/2006" xmlns:o="urn:schemas-microsoft-com:office:office" xmlns:r="http://schemas.openxmlformats.org/officeDocument/2006/relationships" xmlns:m="http://schemas.openxmlformats.org/officeDocument/2006/math" xmlns:v="urn:schemas-microsoft-com:vml" xmlns:wp14="http://schemas.microsoft.com/office/word/2010/wordprocessingDrawing" xmlns:wp="http://schemas.openxmlformats.org/drawingml/2006/wordprocessingDrawing" xmlns:w10="urn:schemas-microsoft-com:office:word" xmlns:w="http://schemas.openxmlformats.org/wordprocessingml/2006/main" xmlns:w14="http://schemas.microsoft.com/office/word/2010/wordml" xmlns:wpg="http://schemas.microsoft.com/office/word/2010/wordprocessingGroup" xmlns:wpi="http://schemas.microsoft.com/office/word/2010/wordprocessingInk" xmlns:wne="http://schemas.microsoft.com/office/word/2006/wordml" xmlns:wps="http://schemas.microsoft.com/office/word/2010/wordprocessingShape" mc:Ignorable="w14 wp14">
+  <w:endnote w:type="separator" w:id="-1">
+    <w:p>
+      <w:pPr>
+        <w:spacing w:after="0" w:line="240" w:lineRule="auto"/>
+      </w:pPr>
+      <w:r>
+        <w:separator/>
+      </w:r>
+    </w:p>
+  </w:endnote>
+  <w:endnote w:type="continuationSeparator" w:id="0">
+    <w:p>
+      <w:pPr>
+        <w:spacing w:after="0" w:line="240" w:lineRule="auto"/>
+      </w:pPr>
+      <w:r>
+        <w:continuationSeparator/>
+      </w:r>
+    </w:p>
+  </w:endnote>
+</w:endnotes>
+</file>
+
+<file path=word/footer1.xml><?xml version="1.0" encoding="utf-8"?>
+<w:ftr xmlns:wpc="http://schemas.microsoft.com/office/word/2010/wordprocessingCanvas" xmlns:mc="http://schemas.openxmlformats.org/markup-compatibility/2006" xmlns:o="urn:schemas-microsoft-com:office:office" xmlns:r="http://schemas.openxmlformats.org/officeDocument/2006/relationships" xmlns:m="http://schemas.openxmlformats.org/officeDocument/2006/math" xmlns:v="urn:schemas-microsoft-com:vml" xmlns:wp14="http://schemas.microsoft.com/office/word/2010/wordprocessingDrawing" xmlns:wp="http://schemas.openxmlformats.org/drawingml/2006/wordprocessingDrawing" xmlns:w10="urn:schemas-microsoft-com:office:word" xmlns:w="http://schemas.openxmlformats.org/wordprocessingml/2006/main" xmlns:w14="http://schemas.microsoft.com/office/word/2010/wordml" xmlns:wpg="http://schemas.microsoft.com/office/word/2010/wordprocessingGroup" xmlns:wpi="http://schemas.microsoft.com/office/word/2010/wordprocessingInk" xmlns:wne="http://schemas.microsoft.com/office/word/2006/wordml" xmlns:wps="http://schemas.microsoft.com/office/word/2010/wordprocessingShape" mc:Ignorable="w14 wp14">
+  <w:sdt>
+    <w:sdtPr>
+      <w:id w:val="-613058578"/>
+      <w:docPartObj>
+        <w:docPartGallery w:val="Page Numbers (Bottom of Page)"/>
+        <w:docPartUnique/>
+      </w:docPartObj>
+    </w:sdtPr>
+    <w:sdtEndPr>
+      <w:rPr>
+        <w:noProof/>
+      </w:rPr>
+    </w:sdtEndPr>
+    <w:sdtContent>
+      <w:p>
+        <w:pPr>
+          <w:pStyle w:val="Footer"/>
+          <w:jc w:val="center"/>
+        </w:pPr>
+        <w:r>
+          <w:fldChar w:fldCharType="begin"/>
+        </w:r>
+        <w:r>
+          <w:instrText xml:space="preserve"> PAGE   \* MERGEFORMAT </w:instrText>
+        </w:r>
+        <w:r>
+          <w:fldChar w:fldCharType="separate"/>
+        </w:r>
+        <w:r>
+          <w:rPr>
+            <w:noProof/>
+          </w:rPr>
+          <w:t>1</w:t>
+        </w:r>
+        <w:r>
+          <w:rPr>
+            <w:noProof/>
+          </w:rPr>
+          <w:fldChar w:fldCharType="end"/>
+        </w:r>
+      </w:p>
+    </w:sdtContent>
+  </w:sdt>
+  <w:p>
+    <w:pPr>
+      <w:pStyle w:val="Footer"/>
+    </w:pPr>
+  </w:p>
+</w:ftr>
+</file>
+
+<file path=word/footnotes.xml><?xml version="1.0" encoding="utf-8"?>
+<w:footnotes xmlns:wpc="http://schemas.microsoft.com/office/word/2010/wordprocessingCanvas" xmlns:mc="http://schemas.openxmlformats.org/markup-compatibility/2006" xmlns:o="urn:schemas-microsoft-com:office:office" xmlns:r="http://schemas.openxmlformats.org/officeDocument/2006/relationships" xmlns:m="http://schemas.openxmlformats.org/officeDocument/2006/math" xmlns:v="urn:schemas-microsoft-com:vml" xmlns:wp14="http://schemas.microsoft.com/office/word/2010/wordprocessingDrawing" xmlns:wp="http://schemas.openxmlformats.org/drawingml/2006/wordprocessingDrawing" xmlns:w10="urn:schemas-microsoft-com:office:word" xmlns:w="http://schemas.openxmlformats.org/wordprocessingml/2006/main" xmlns:w14="http://schemas.microsoft.com/office/word/2010/wordml" xmlns:wpg="http://schemas.microsoft.com/office/word/2010/wordprocessingGroup" xmlns:wpi="http://schemas.microsoft.com/office/word/2010/wordprocessingInk" xmlns:wne="http://schemas.microsoft.com/office/word/2006/wordml" xmlns:wps="http://schemas.microsoft.com/office/word/2010/wordprocessingShape" mc:Ignorable="w14 wp14">
+  <w:footnote w:type="separator" w:id="-1">
+    <w:p>
+      <w:pPr>
+        <w:spacing w:after="0" w:line="240" w:lineRule="auto"/>
+      </w:pPr>
+      <w:r>
+        <w:separator/>
+      </w:r>
+    </w:p>
+  </w:footnote>
+  <w:footnote w:type="continuationSeparator" w:id="0">
+    <w:p>
+      <w:pPr>
+        <w:spacing w:after="0" w:line="240" w:lineRule="auto"/>
+      </w:pPr>
+      <w:r>
+        <w:continuationSeparator/>
+      </w:r>
+    </w:p>
+  </w:footnote>
+</w:footnotes>
+</file>
+
 <file path=word/numbering.xml><?xml version="1.0" encoding="utf-8"?>
 <w:numbering xmlns:wpc="http://schemas.microsoft.com/office/word/2010/wordprocessingCanvas" xmlns:mc="http://schemas.openxmlformats.org/markup-compatibility/2006" xmlns:o="urn:schemas-microsoft-com:office:office" xmlns:r="http://schemas.openxmlformats.org/officeDocument/2006/relationships" xmlns:m="http://schemas.openxmlformats.org/officeDocument/2006/math" xmlns:v="urn:schemas-microsoft-com:vml" xmlns:wp14="http://schemas.microsoft.com/office/word/2010/wordprocessingDrawing" xmlns:wp="http://schemas.openxmlformats.org/drawingml/2006/wordprocessingDrawing" xmlns:w10="urn:schemas-microsoft-com:office:word" xmlns:w="http://schemas.openxmlformats.org/wordprocessingml/2006/main" xmlns:w14="http://schemas.microsoft.com/office/word/2010/wordml" xmlns:wpg="http://schemas.microsoft.com/office/word/2010/wordprocessingGroup" xmlns:wpi="http://schemas.microsoft.com/office/word/2010/wordprocessingInk" xmlns:wne="http://schemas.microsoft.com/office/word/2006/wordml" xmlns:wps="http://schemas.microsoft.com/office/word/2010/wordprocessingShape" mc:Ignorable="w14 wp14">
   <w:abstractNum w:abstractNumId="0">
+    <w:nsid w:val="062A2E5D"/>
+    <w:multiLevelType w:val="hybridMultilevel"/>
+    <w:tmpl w:val="2E60A466"/>
+    <w:lvl w:ilvl="0" w:tplc="E07EFAFC">
+      <w:numFmt w:val="bullet"/>
+      <w:lvlText w:val=""/>
+      <w:lvlJc w:val="left"/>
+      <w:pPr>
+        <w:ind w:left="720" w:hanging="360"/>
+      </w:pPr>
+      <w:rPr>
+        <w:rFonts w:ascii="Symbol" w:eastAsiaTheme="minorHAnsi" w:hAnsi="Symbol" w:cs="Tahoma" w:hint="default"/>
+      </w:rPr>
+    </w:lvl>
+    <w:lvl w:ilvl="1" w:tplc="04090003" w:tentative="1">
+      <w:start w:val="1"/>
+      <w:numFmt w:val="bullet"/>
+      <w:lvlText w:val="o"/>
+      <w:lvlJc w:val="left"/>
+      <w:pPr>
+        <w:ind w:left="1440" w:hanging="360"/>
+      </w:pPr>
+      <w:rPr>
+        <w:rFonts w:ascii="Courier New" w:hAnsi="Courier New" w:cs="Courier New" w:hint="default"/>
+      </w:rPr>
+    </w:lvl>
+    <w:lvl w:ilvl="2" w:tplc="04090005" w:tentative="1">
+      <w:start w:val="1"/>
+      <w:numFmt w:val="bullet"/>
+      <w:lvlText w:val=""/>
+      <w:lvlJc w:val="left"/>
+      <w:pPr>
+        <w:ind w:left="2160" w:hanging="360"/>
+      </w:pPr>
+      <w:rPr>
+        <w:rFonts w:ascii="Wingdings" w:hAnsi="Wingdings" w:hint="default"/>
+      </w:rPr>
+    </w:lvl>
+    <w:lvl w:ilvl="3" w:tplc="04090001" w:tentative="1">
+      <w:start w:val="1"/>
+      <w:numFmt w:val="bullet"/>
+      <w:lvlText w:val=""/>
+      <w:lvlJc w:val="left"/>
+      <w:pPr>
+        <w:ind w:left="2880" w:hanging="360"/>
+      </w:pPr>
+      <w:rPr>
+        <w:rFonts w:ascii="Symbol" w:hAnsi="Symbol" w:hint="default"/>
+      </w:rPr>
+    </w:lvl>
+    <w:lvl w:ilvl="4" w:tplc="04090003" w:tentative="1">
+      <w:start w:val="1"/>
+      <w:numFmt w:val="bullet"/>
+      <w:lvlText w:val="o"/>
+      <w:lvlJc w:val="left"/>
+      <w:pPr>
+        <w:ind w:left="3600" w:hanging="360"/>
+      </w:pPr>
+      <w:rPr>
+        <w:rFonts w:ascii="Courier New" w:hAnsi="Courier New" w:cs="Courier New" w:hint="default"/>
+      </w:rPr>
+    </w:lvl>
+    <w:lvl w:ilvl="5" w:tplc="04090005" w:tentative="1">
+      <w:start w:val="1"/>
+      <w:numFmt w:val="bullet"/>
+      <w:lvlText w:val=""/>
+      <w:lvlJc w:val="left"/>
+      <w:pPr>
+        <w:ind w:left="4320" w:hanging="360"/>
+      </w:pPr>
+      <w:rPr>
+        <w:rFonts w:ascii="Wingdings" w:hAnsi="Wingdings" w:hint="default"/>
+      </w:rPr>
+    </w:lvl>
+    <w:lvl w:ilvl="6" w:tplc="04090001" w:tentative="1">
+      <w:start w:val="1"/>
+      <w:numFmt w:val="bullet"/>
+      <w:lvlText w:val=""/>
+      <w:lvlJc w:val="left"/>
+      <w:pPr>
+        <w:ind w:left="5040" w:hanging="360"/>
+      </w:pPr>
+      <w:rPr>
+        <w:rFonts w:ascii="Symbol" w:hAnsi="Symbol" w:hint="default"/>
+      </w:rPr>
+    </w:lvl>
+    <w:lvl w:ilvl="7" w:tplc="04090003" w:tentative="1">
+      <w:start w:val="1"/>
+      <w:numFmt w:val="bullet"/>
+      <w:lvlText w:val="o"/>
+      <w:lvlJc w:val="left"/>
+      <w:pPr>
+        <w:ind w:left="5760" w:hanging="360"/>
+      </w:pPr>
+      <w:rPr>
+        <w:rFonts w:ascii="Courier New" w:hAnsi="Courier New" w:cs="Courier New" w:hint="default"/>
+      </w:rPr>
+    </w:lvl>
+    <w:lvl w:ilvl="8" w:tplc="04090005" w:tentative="1">
+      <w:start w:val="1"/>
+      <w:numFmt w:val="bullet"/>
+      <w:lvlText w:val=""/>
+      <w:lvlJc w:val="left"/>
+      <w:pPr>
+        <w:ind w:left="6480" w:hanging="360"/>
+      </w:pPr>
+      <w:rPr>
+        <w:rFonts w:ascii="Wingdings" w:hAnsi="Wingdings" w:hint="default"/>
+      </w:rPr>
+    </w:lvl>
+  </w:abstractNum>
+  <w:abstractNum w:abstractNumId="1">
     <w:nsid w:val="16DC1AB6"/>
     <w:multiLevelType w:val="multilevel"/>
     <w:tmpl w:val="E32465B2"/>
@@ -4867,7 +6304,93 @@
       </w:rPr>
     </w:lvl>
   </w:abstractNum>
-  <w:abstractNum w:abstractNumId="1">
+  <w:abstractNum w:abstractNumId="2">
+    <w:nsid w:val="1F3B5ED7"/>
+    <w:multiLevelType w:val="hybridMultilevel"/>
+    <w:tmpl w:val="ED56A8A6"/>
+    <w:lvl w:ilvl="0" w:tplc="0409000F">
+      <w:start w:val="1"/>
+      <w:numFmt w:val="decimal"/>
+      <w:lvlText w:val="%1."/>
+      <w:lvlJc w:val="left"/>
+      <w:pPr>
+        <w:ind w:left="801" w:hanging="360"/>
+      </w:pPr>
+    </w:lvl>
+    <w:lvl w:ilvl="1" w:tplc="04090019" w:tentative="1">
+      <w:start w:val="1"/>
+      <w:numFmt w:val="lowerLetter"/>
+      <w:lvlText w:val="%2."/>
+      <w:lvlJc w:val="left"/>
+      <w:pPr>
+        <w:ind w:left="1521" w:hanging="360"/>
+      </w:pPr>
+    </w:lvl>
+    <w:lvl w:ilvl="2" w:tplc="0409001B" w:tentative="1">
+      <w:start w:val="1"/>
+      <w:numFmt w:val="lowerRoman"/>
+      <w:lvlText w:val="%3."/>
+      <w:lvlJc w:val="right"/>
+      <w:pPr>
+        <w:ind w:left="2241" w:hanging="180"/>
+      </w:pPr>
+    </w:lvl>
+    <w:lvl w:ilvl="3" w:tplc="0409000F" w:tentative="1">
+      <w:start w:val="1"/>
+      <w:numFmt w:val="decimal"/>
+      <w:lvlText w:val="%4."/>
+      <w:lvlJc w:val="left"/>
+      <w:pPr>
+        <w:ind w:left="2961" w:hanging="360"/>
+      </w:pPr>
+    </w:lvl>
+    <w:lvl w:ilvl="4" w:tplc="04090019" w:tentative="1">
+      <w:start w:val="1"/>
+      <w:numFmt w:val="lowerLetter"/>
+      <w:lvlText w:val="%5."/>
+      <w:lvlJc w:val="left"/>
+      <w:pPr>
+        <w:ind w:left="3681" w:hanging="360"/>
+      </w:pPr>
+    </w:lvl>
+    <w:lvl w:ilvl="5" w:tplc="0409001B" w:tentative="1">
+      <w:start w:val="1"/>
+      <w:numFmt w:val="lowerRoman"/>
+      <w:lvlText w:val="%6."/>
+      <w:lvlJc w:val="right"/>
+      <w:pPr>
+        <w:ind w:left="4401" w:hanging="180"/>
+      </w:pPr>
+    </w:lvl>
+    <w:lvl w:ilvl="6" w:tplc="0409000F" w:tentative="1">
+      <w:start w:val="1"/>
+      <w:numFmt w:val="decimal"/>
+      <w:lvlText w:val="%7."/>
+      <w:lvlJc w:val="left"/>
+      <w:pPr>
+        <w:ind w:left="5121" w:hanging="360"/>
+      </w:pPr>
+    </w:lvl>
+    <w:lvl w:ilvl="7" w:tplc="04090019" w:tentative="1">
+      <w:start w:val="1"/>
+      <w:numFmt w:val="lowerLetter"/>
+      <w:lvlText w:val="%8."/>
+      <w:lvlJc w:val="left"/>
+      <w:pPr>
+        <w:ind w:left="5841" w:hanging="360"/>
+      </w:pPr>
+    </w:lvl>
+    <w:lvl w:ilvl="8" w:tplc="0409001B" w:tentative="1">
+      <w:start w:val="1"/>
+      <w:numFmt w:val="lowerRoman"/>
+      <w:lvlText w:val="%9."/>
+      <w:lvlJc w:val="right"/>
+      <w:pPr>
+        <w:ind w:left="6561" w:hanging="180"/>
+      </w:pPr>
+    </w:lvl>
+  </w:abstractNum>
+  <w:abstractNum w:abstractNumId="3">
     <w:nsid w:val="234B34E7"/>
     <w:multiLevelType w:val="hybridMultilevel"/>
     <w:tmpl w:val="85EC178C"/>
@@ -4953,7 +6476,98 @@
       </w:pPr>
     </w:lvl>
   </w:abstractNum>
-  <w:abstractNum w:abstractNumId="2">
+  <w:abstractNum w:abstractNumId="4">
+    <w:nsid w:val="2794162F"/>
+    <w:multiLevelType w:val="hybridMultilevel"/>
+    <w:tmpl w:val="73168284"/>
+    <w:lvl w:ilvl="0" w:tplc="51A6D3E4">
+      <w:start w:val="1"/>
+      <w:numFmt w:val="decimal"/>
+      <w:lvlText w:val="%1."/>
+      <w:lvlJc w:val="left"/>
+      <w:pPr>
+        <w:ind w:left="720" w:hanging="360"/>
+      </w:pPr>
+      <w:rPr>
+        <w:rFonts w:hint="default"/>
+        <w:b/>
+        <w:u w:val="single"/>
+      </w:rPr>
+    </w:lvl>
+    <w:lvl w:ilvl="1" w:tplc="04090019" w:tentative="1">
+      <w:start w:val="1"/>
+      <w:numFmt w:val="lowerLetter"/>
+      <w:lvlText w:val="%2."/>
+      <w:lvlJc w:val="left"/>
+      <w:pPr>
+        <w:ind w:left="1440" w:hanging="360"/>
+      </w:pPr>
+    </w:lvl>
+    <w:lvl w:ilvl="2" w:tplc="0409001B" w:tentative="1">
+      <w:start w:val="1"/>
+      <w:numFmt w:val="lowerRoman"/>
+      <w:lvlText w:val="%3."/>
+      <w:lvlJc w:val="right"/>
+      <w:pPr>
+        <w:ind w:left="2160" w:hanging="180"/>
+      </w:pPr>
+    </w:lvl>
+    <w:lvl w:ilvl="3" w:tplc="0409000F" w:tentative="1">
+      <w:start w:val="1"/>
+      <w:numFmt w:val="decimal"/>
+      <w:lvlText w:val="%4."/>
+      <w:lvlJc w:val="left"/>
+      <w:pPr>
+        <w:ind w:left="2880" w:hanging="360"/>
+      </w:pPr>
+    </w:lvl>
+    <w:lvl w:ilvl="4" w:tplc="04090019" w:tentative="1">
+      <w:start w:val="1"/>
+      <w:numFmt w:val="lowerLetter"/>
+      <w:lvlText w:val="%5."/>
+      <w:lvlJc w:val="left"/>
+      <w:pPr>
+        <w:ind w:left="3600" w:hanging="360"/>
+      </w:pPr>
+    </w:lvl>
+    <w:lvl w:ilvl="5" w:tplc="0409001B" w:tentative="1">
+      <w:start w:val="1"/>
+      <w:numFmt w:val="lowerRoman"/>
+      <w:lvlText w:val="%6."/>
+      <w:lvlJc w:val="right"/>
+      <w:pPr>
+        <w:ind w:left="4320" w:hanging="180"/>
+      </w:pPr>
+    </w:lvl>
+    <w:lvl w:ilvl="6" w:tplc="0409000F" w:tentative="1">
+      <w:start w:val="1"/>
+      <w:numFmt w:val="decimal"/>
+      <w:lvlText w:val="%7."/>
+      <w:lvlJc w:val="left"/>
+      <w:pPr>
+        <w:ind w:left="5040" w:hanging="360"/>
+      </w:pPr>
+    </w:lvl>
+    <w:lvl w:ilvl="7" w:tplc="04090019" w:tentative="1">
+      <w:start w:val="1"/>
+      <w:numFmt w:val="lowerLetter"/>
+      <w:lvlText w:val="%8."/>
+      <w:lvlJc w:val="left"/>
+      <w:pPr>
+        <w:ind w:left="5760" w:hanging="360"/>
+      </w:pPr>
+    </w:lvl>
+    <w:lvl w:ilvl="8" w:tplc="0409001B" w:tentative="1">
+      <w:start w:val="1"/>
+      <w:numFmt w:val="lowerRoman"/>
+      <w:lvlText w:val="%9."/>
+      <w:lvlJc w:val="right"/>
+      <w:pPr>
+        <w:ind w:left="6480" w:hanging="180"/>
+      </w:pPr>
+    </w:lvl>
+  </w:abstractNum>
+  <w:abstractNum w:abstractNumId="5">
     <w:nsid w:val="3568185D"/>
     <w:multiLevelType w:val="multilevel"/>
     <w:tmpl w:val="9F5ABE16"/>
@@ -5102,14 +6716,433 @@
       </w:rPr>
     </w:lvl>
   </w:abstractNum>
+  <w:abstractNum w:abstractNumId="6">
+    <w:nsid w:val="3A1D316D"/>
+    <w:multiLevelType w:val="hybridMultilevel"/>
+    <w:tmpl w:val="F48E8116"/>
+    <w:lvl w:ilvl="0" w:tplc="0409000F">
+      <w:start w:val="1"/>
+      <w:numFmt w:val="decimal"/>
+      <w:lvlText w:val="%1."/>
+      <w:lvlJc w:val="left"/>
+      <w:pPr>
+        <w:ind w:left="720" w:hanging="360"/>
+      </w:pPr>
+    </w:lvl>
+    <w:lvl w:ilvl="1" w:tplc="04090019" w:tentative="1">
+      <w:start w:val="1"/>
+      <w:numFmt w:val="lowerLetter"/>
+      <w:lvlText w:val="%2."/>
+      <w:lvlJc w:val="left"/>
+      <w:pPr>
+        <w:ind w:left="1440" w:hanging="360"/>
+      </w:pPr>
+    </w:lvl>
+    <w:lvl w:ilvl="2" w:tplc="0409001B" w:tentative="1">
+      <w:start w:val="1"/>
+      <w:numFmt w:val="lowerRoman"/>
+      <w:lvlText w:val="%3."/>
+      <w:lvlJc w:val="right"/>
+      <w:pPr>
+        <w:ind w:left="2160" w:hanging="180"/>
+      </w:pPr>
+    </w:lvl>
+    <w:lvl w:ilvl="3" w:tplc="0409000F" w:tentative="1">
+      <w:start w:val="1"/>
+      <w:numFmt w:val="decimal"/>
+      <w:lvlText w:val="%4."/>
+      <w:lvlJc w:val="left"/>
+      <w:pPr>
+        <w:ind w:left="2880" w:hanging="360"/>
+      </w:pPr>
+    </w:lvl>
+    <w:lvl w:ilvl="4" w:tplc="04090019" w:tentative="1">
+      <w:start w:val="1"/>
+      <w:numFmt w:val="lowerLetter"/>
+      <w:lvlText w:val="%5."/>
+      <w:lvlJc w:val="left"/>
+      <w:pPr>
+        <w:ind w:left="3600" w:hanging="360"/>
+      </w:pPr>
+    </w:lvl>
+    <w:lvl w:ilvl="5" w:tplc="0409001B" w:tentative="1">
+      <w:start w:val="1"/>
+      <w:numFmt w:val="lowerRoman"/>
+      <w:lvlText w:val="%6."/>
+      <w:lvlJc w:val="right"/>
+      <w:pPr>
+        <w:ind w:left="4320" w:hanging="180"/>
+      </w:pPr>
+    </w:lvl>
+    <w:lvl w:ilvl="6" w:tplc="0409000F" w:tentative="1">
+      <w:start w:val="1"/>
+      <w:numFmt w:val="decimal"/>
+      <w:lvlText w:val="%7."/>
+      <w:lvlJc w:val="left"/>
+      <w:pPr>
+        <w:ind w:left="5040" w:hanging="360"/>
+      </w:pPr>
+    </w:lvl>
+    <w:lvl w:ilvl="7" w:tplc="04090019" w:tentative="1">
+      <w:start w:val="1"/>
+      <w:numFmt w:val="lowerLetter"/>
+      <w:lvlText w:val="%8."/>
+      <w:lvlJc w:val="left"/>
+      <w:pPr>
+        <w:ind w:left="5760" w:hanging="360"/>
+      </w:pPr>
+    </w:lvl>
+    <w:lvl w:ilvl="8" w:tplc="0409001B" w:tentative="1">
+      <w:start w:val="1"/>
+      <w:numFmt w:val="lowerRoman"/>
+      <w:lvlText w:val="%9."/>
+      <w:lvlJc w:val="right"/>
+      <w:pPr>
+        <w:ind w:left="6480" w:hanging="180"/>
+      </w:pPr>
+    </w:lvl>
+  </w:abstractNum>
+  <w:abstractNum w:abstractNumId="7">
+    <w:nsid w:val="4F78028C"/>
+    <w:multiLevelType w:val="hybridMultilevel"/>
+    <w:tmpl w:val="906E520E"/>
+    <w:lvl w:ilvl="0" w:tplc="3BC42400">
+      <w:numFmt w:val="bullet"/>
+      <w:lvlText w:val=""/>
+      <w:lvlJc w:val="left"/>
+      <w:pPr>
+        <w:ind w:left="720" w:hanging="360"/>
+      </w:pPr>
+      <w:rPr>
+        <w:rFonts w:ascii="Symbol" w:eastAsiaTheme="minorHAnsi" w:hAnsi="Symbol" w:cs="Tahoma" w:hint="default"/>
+        <w:b w:val="0"/>
+        <w:u w:val="none"/>
+      </w:rPr>
+    </w:lvl>
+    <w:lvl w:ilvl="1" w:tplc="04090003" w:tentative="1">
+      <w:start w:val="1"/>
+      <w:numFmt w:val="bullet"/>
+      <w:lvlText w:val="o"/>
+      <w:lvlJc w:val="left"/>
+      <w:pPr>
+        <w:ind w:left="1440" w:hanging="360"/>
+      </w:pPr>
+      <w:rPr>
+        <w:rFonts w:ascii="Courier New" w:hAnsi="Courier New" w:cs="Courier New" w:hint="default"/>
+      </w:rPr>
+    </w:lvl>
+    <w:lvl w:ilvl="2" w:tplc="04090005" w:tentative="1">
+      <w:start w:val="1"/>
+      <w:numFmt w:val="bullet"/>
+      <w:lvlText w:val=""/>
+      <w:lvlJc w:val="left"/>
+      <w:pPr>
+        <w:ind w:left="2160" w:hanging="360"/>
+      </w:pPr>
+      <w:rPr>
+        <w:rFonts w:ascii="Wingdings" w:hAnsi="Wingdings" w:hint="default"/>
+      </w:rPr>
+    </w:lvl>
+    <w:lvl w:ilvl="3" w:tplc="04090001" w:tentative="1">
+      <w:start w:val="1"/>
+      <w:numFmt w:val="bullet"/>
+      <w:lvlText w:val=""/>
+      <w:lvlJc w:val="left"/>
+      <w:pPr>
+        <w:ind w:left="2880" w:hanging="360"/>
+      </w:pPr>
+      <w:rPr>
+        <w:rFonts w:ascii="Symbol" w:hAnsi="Symbol" w:hint="default"/>
+      </w:rPr>
+    </w:lvl>
+    <w:lvl w:ilvl="4" w:tplc="04090003" w:tentative="1">
+      <w:start w:val="1"/>
+      <w:numFmt w:val="bullet"/>
+      <w:lvlText w:val="o"/>
+      <w:lvlJc w:val="left"/>
+      <w:pPr>
+        <w:ind w:left="3600" w:hanging="360"/>
+      </w:pPr>
+      <w:rPr>
+        <w:rFonts w:ascii="Courier New" w:hAnsi="Courier New" w:cs="Courier New" w:hint="default"/>
+      </w:rPr>
+    </w:lvl>
+    <w:lvl w:ilvl="5" w:tplc="04090005" w:tentative="1">
+      <w:start w:val="1"/>
+      <w:numFmt w:val="bullet"/>
+      <w:lvlText w:val=""/>
+      <w:lvlJc w:val="left"/>
+      <w:pPr>
+        <w:ind w:left="4320" w:hanging="360"/>
+      </w:pPr>
+      <w:rPr>
+        <w:rFonts w:ascii="Wingdings" w:hAnsi="Wingdings" w:hint="default"/>
+      </w:rPr>
+    </w:lvl>
+    <w:lvl w:ilvl="6" w:tplc="04090001" w:tentative="1">
+      <w:start w:val="1"/>
+      <w:numFmt w:val="bullet"/>
+      <w:lvlText w:val=""/>
+      <w:lvlJc w:val="left"/>
+      <w:pPr>
+        <w:ind w:left="5040" w:hanging="360"/>
+      </w:pPr>
+      <w:rPr>
+        <w:rFonts w:ascii="Symbol" w:hAnsi="Symbol" w:hint="default"/>
+      </w:rPr>
+    </w:lvl>
+    <w:lvl w:ilvl="7" w:tplc="04090003" w:tentative="1">
+      <w:start w:val="1"/>
+      <w:numFmt w:val="bullet"/>
+      <w:lvlText w:val="o"/>
+      <w:lvlJc w:val="left"/>
+      <w:pPr>
+        <w:ind w:left="5760" w:hanging="360"/>
+      </w:pPr>
+      <w:rPr>
+        <w:rFonts w:ascii="Courier New" w:hAnsi="Courier New" w:cs="Courier New" w:hint="default"/>
+      </w:rPr>
+    </w:lvl>
+    <w:lvl w:ilvl="8" w:tplc="04090005" w:tentative="1">
+      <w:start w:val="1"/>
+      <w:numFmt w:val="bullet"/>
+      <w:lvlText w:val=""/>
+      <w:lvlJc w:val="left"/>
+      <w:pPr>
+        <w:ind w:left="6480" w:hanging="360"/>
+      </w:pPr>
+      <w:rPr>
+        <w:rFonts w:ascii="Wingdings" w:hAnsi="Wingdings" w:hint="default"/>
+      </w:rPr>
+    </w:lvl>
+  </w:abstractNum>
+  <w:abstractNum w:abstractNumId="8">
+    <w:nsid w:val="59F54F96"/>
+    <w:multiLevelType w:val="hybridMultilevel"/>
+    <w:tmpl w:val="C5F4D322"/>
+    <w:lvl w:ilvl="0" w:tplc="6C706B7A">
+      <w:numFmt w:val="bullet"/>
+      <w:lvlText w:val=""/>
+      <w:lvlJc w:val="left"/>
+      <w:pPr>
+        <w:ind w:left="720" w:hanging="360"/>
+      </w:pPr>
+      <w:rPr>
+        <w:rFonts w:ascii="Symbol" w:eastAsiaTheme="minorHAnsi" w:hAnsi="Symbol" w:cs="Tahoma" w:hint="default"/>
+      </w:rPr>
+    </w:lvl>
+    <w:lvl w:ilvl="1" w:tplc="04090003" w:tentative="1">
+      <w:start w:val="1"/>
+      <w:numFmt w:val="bullet"/>
+      <w:lvlText w:val="o"/>
+      <w:lvlJc w:val="left"/>
+      <w:pPr>
+        <w:ind w:left="1440" w:hanging="360"/>
+      </w:pPr>
+      <w:rPr>
+        <w:rFonts w:ascii="Courier New" w:hAnsi="Courier New" w:cs="Courier New" w:hint="default"/>
+      </w:rPr>
+    </w:lvl>
+    <w:lvl w:ilvl="2" w:tplc="04090005" w:tentative="1">
+      <w:start w:val="1"/>
+      <w:numFmt w:val="bullet"/>
+      <w:lvlText w:val=""/>
+      <w:lvlJc w:val="left"/>
+      <w:pPr>
+        <w:ind w:left="2160" w:hanging="360"/>
+      </w:pPr>
+      <w:rPr>
+        <w:rFonts w:ascii="Wingdings" w:hAnsi="Wingdings" w:hint="default"/>
+      </w:rPr>
+    </w:lvl>
+    <w:lvl w:ilvl="3" w:tplc="04090001" w:tentative="1">
+      <w:start w:val="1"/>
+      <w:numFmt w:val="bullet"/>
+      <w:lvlText w:val=""/>
+      <w:lvlJc w:val="left"/>
+      <w:pPr>
+        <w:ind w:left="2880" w:hanging="360"/>
+      </w:pPr>
+      <w:rPr>
+        <w:rFonts w:ascii="Symbol" w:hAnsi="Symbol" w:hint="default"/>
+      </w:rPr>
+    </w:lvl>
+    <w:lvl w:ilvl="4" w:tplc="04090003" w:tentative="1">
+      <w:start w:val="1"/>
+      <w:numFmt w:val="bullet"/>
+      <w:lvlText w:val="o"/>
+      <w:lvlJc w:val="left"/>
+      <w:pPr>
+        <w:ind w:left="3600" w:hanging="360"/>
+      </w:pPr>
+      <w:rPr>
+        <w:rFonts w:ascii="Courier New" w:hAnsi="Courier New" w:cs="Courier New" w:hint="default"/>
+      </w:rPr>
+    </w:lvl>
+    <w:lvl w:ilvl="5" w:tplc="04090005" w:tentative="1">
+      <w:start w:val="1"/>
+      <w:numFmt w:val="bullet"/>
+      <w:lvlText w:val=""/>
+      <w:lvlJc w:val="left"/>
+      <w:pPr>
+        <w:ind w:left="4320" w:hanging="360"/>
+      </w:pPr>
+      <w:rPr>
+        <w:rFonts w:ascii="Wingdings" w:hAnsi="Wingdings" w:hint="default"/>
+      </w:rPr>
+    </w:lvl>
+    <w:lvl w:ilvl="6" w:tplc="04090001" w:tentative="1">
+      <w:start w:val="1"/>
+      <w:numFmt w:val="bullet"/>
+      <w:lvlText w:val=""/>
+      <w:lvlJc w:val="left"/>
+      <w:pPr>
+        <w:ind w:left="5040" w:hanging="360"/>
+      </w:pPr>
+      <w:rPr>
+        <w:rFonts w:ascii="Symbol" w:hAnsi="Symbol" w:hint="default"/>
+      </w:rPr>
+    </w:lvl>
+    <w:lvl w:ilvl="7" w:tplc="04090003" w:tentative="1">
+      <w:start w:val="1"/>
+      <w:numFmt w:val="bullet"/>
+      <w:lvlText w:val="o"/>
+      <w:lvlJc w:val="left"/>
+      <w:pPr>
+        <w:ind w:left="5760" w:hanging="360"/>
+      </w:pPr>
+      <w:rPr>
+        <w:rFonts w:ascii="Courier New" w:hAnsi="Courier New" w:cs="Courier New" w:hint="default"/>
+      </w:rPr>
+    </w:lvl>
+    <w:lvl w:ilvl="8" w:tplc="04090005" w:tentative="1">
+      <w:start w:val="1"/>
+      <w:numFmt w:val="bullet"/>
+      <w:lvlText w:val=""/>
+      <w:lvlJc w:val="left"/>
+      <w:pPr>
+        <w:ind w:left="6480" w:hanging="360"/>
+      </w:pPr>
+      <w:rPr>
+        <w:rFonts w:ascii="Wingdings" w:hAnsi="Wingdings" w:hint="default"/>
+      </w:rPr>
+    </w:lvl>
+  </w:abstractNum>
+  <w:abstractNum w:abstractNumId="9">
+    <w:nsid w:val="70AB2354"/>
+    <w:multiLevelType w:val="hybridMultilevel"/>
+    <w:tmpl w:val="C60A13A4"/>
+    <w:lvl w:ilvl="0" w:tplc="04090011">
+      <w:start w:val="1"/>
+      <w:numFmt w:val="decimal"/>
+      <w:lvlText w:val="%1)"/>
+      <w:lvlJc w:val="left"/>
+      <w:pPr>
+        <w:ind w:left="720" w:hanging="360"/>
+      </w:pPr>
+    </w:lvl>
+    <w:lvl w:ilvl="1" w:tplc="04090019" w:tentative="1">
+      <w:start w:val="1"/>
+      <w:numFmt w:val="lowerLetter"/>
+      <w:lvlText w:val="%2."/>
+      <w:lvlJc w:val="left"/>
+      <w:pPr>
+        <w:ind w:left="1440" w:hanging="360"/>
+      </w:pPr>
+    </w:lvl>
+    <w:lvl w:ilvl="2" w:tplc="0409001B" w:tentative="1">
+      <w:start w:val="1"/>
+      <w:numFmt w:val="lowerRoman"/>
+      <w:lvlText w:val="%3."/>
+      <w:lvlJc w:val="right"/>
+      <w:pPr>
+        <w:ind w:left="2160" w:hanging="180"/>
+      </w:pPr>
+    </w:lvl>
+    <w:lvl w:ilvl="3" w:tplc="0409000F" w:tentative="1">
+      <w:start w:val="1"/>
+      <w:numFmt w:val="decimal"/>
+      <w:lvlText w:val="%4."/>
+      <w:lvlJc w:val="left"/>
+      <w:pPr>
+        <w:ind w:left="2880" w:hanging="360"/>
+      </w:pPr>
+    </w:lvl>
+    <w:lvl w:ilvl="4" w:tplc="04090019" w:tentative="1">
+      <w:start w:val="1"/>
+      <w:numFmt w:val="lowerLetter"/>
+      <w:lvlText w:val="%5."/>
+      <w:lvlJc w:val="left"/>
+      <w:pPr>
+        <w:ind w:left="3600" w:hanging="360"/>
+      </w:pPr>
+    </w:lvl>
+    <w:lvl w:ilvl="5" w:tplc="0409001B" w:tentative="1">
+      <w:start w:val="1"/>
+      <w:numFmt w:val="lowerRoman"/>
+      <w:lvlText w:val="%6."/>
+      <w:lvlJc w:val="right"/>
+      <w:pPr>
+        <w:ind w:left="4320" w:hanging="180"/>
+      </w:pPr>
+    </w:lvl>
+    <w:lvl w:ilvl="6" w:tplc="0409000F" w:tentative="1">
+      <w:start w:val="1"/>
+      <w:numFmt w:val="decimal"/>
+      <w:lvlText w:val="%7."/>
+      <w:lvlJc w:val="left"/>
+      <w:pPr>
+        <w:ind w:left="5040" w:hanging="360"/>
+      </w:pPr>
+    </w:lvl>
+    <w:lvl w:ilvl="7" w:tplc="04090019" w:tentative="1">
+      <w:start w:val="1"/>
+      <w:numFmt w:val="lowerLetter"/>
+      <w:lvlText w:val="%8."/>
+      <w:lvlJc w:val="left"/>
+      <w:pPr>
+        <w:ind w:left="5760" w:hanging="360"/>
+      </w:pPr>
+    </w:lvl>
+    <w:lvl w:ilvl="8" w:tplc="0409001B" w:tentative="1">
+      <w:start w:val="1"/>
+      <w:numFmt w:val="lowerRoman"/>
+      <w:lvlText w:val="%9."/>
+      <w:lvlJc w:val="right"/>
+      <w:pPr>
+        <w:ind w:left="6480" w:hanging="180"/>
+      </w:pPr>
+    </w:lvl>
+  </w:abstractNum>
   <w:num w:numId="1">
+    <w:abstractNumId w:val="3"/>
+  </w:num>
+  <w:num w:numId="2">
     <w:abstractNumId w:val="1"/>
   </w:num>
-  <w:num w:numId="2">
+  <w:num w:numId="3">
+    <w:abstractNumId w:val="5"/>
+  </w:num>
+  <w:num w:numId="4">
+    <w:abstractNumId w:val="2"/>
+  </w:num>
+  <w:num w:numId="5">
+    <w:abstractNumId w:val="6"/>
+  </w:num>
+  <w:num w:numId="6">
+    <w:abstractNumId w:val="9"/>
+  </w:num>
+  <w:num w:numId="7">
+    <w:abstractNumId w:val="8"/>
+  </w:num>
+  <w:num w:numId="8">
     <w:abstractNumId w:val="0"/>
   </w:num>
-  <w:num w:numId="3">
-    <w:abstractNumId w:val="2"/>
+  <w:num w:numId="9">
+    <w:abstractNumId w:val="7"/>
+  </w:num>
+  <w:num w:numId="10">
+    <w:abstractNumId w:val="4"/>
   </w:num>
 </w:numbering>
 </file>
@@ -5380,6 +7413,50 @@
     <w:basedOn w:val="DefaultParagraphFont"/>
     <w:rsid w:val="00DB3CF9"/>
   </w:style>
+  <w:style w:type="paragraph" w:styleId="Header">
+    <w:name w:val="header"/>
+    <w:basedOn w:val="Normal"/>
+    <w:link w:val="HeaderChar"/>
+    <w:uiPriority w:val="99"/>
+    <w:unhideWhenUsed/>
+    <w:rsid w:val="002475E3"/>
+    <w:pPr>
+      <w:tabs>
+        <w:tab w:val="center" w:pos="4680"/>
+        <w:tab w:val="right" w:pos="9360"/>
+      </w:tabs>
+      <w:spacing w:after="0" w:line="240" w:lineRule="auto"/>
+    </w:pPr>
+  </w:style>
+  <w:style w:type="character" w:customStyle="1" w:styleId="HeaderChar">
+    <w:name w:val="Header Char"/>
+    <w:basedOn w:val="DefaultParagraphFont"/>
+    <w:link w:val="Header"/>
+    <w:uiPriority w:val="99"/>
+    <w:rsid w:val="002475E3"/>
+  </w:style>
+  <w:style w:type="paragraph" w:styleId="Footer">
+    <w:name w:val="footer"/>
+    <w:basedOn w:val="Normal"/>
+    <w:link w:val="FooterChar"/>
+    <w:uiPriority w:val="99"/>
+    <w:unhideWhenUsed/>
+    <w:rsid w:val="002475E3"/>
+    <w:pPr>
+      <w:tabs>
+        <w:tab w:val="center" w:pos="4680"/>
+        <w:tab w:val="right" w:pos="9360"/>
+      </w:tabs>
+      <w:spacing w:after="0" w:line="240" w:lineRule="auto"/>
+    </w:pPr>
+  </w:style>
+  <w:style w:type="character" w:customStyle="1" w:styleId="FooterChar">
+    <w:name w:val="Footer Char"/>
+    <w:basedOn w:val="DefaultParagraphFont"/>
+    <w:link w:val="Footer"/>
+    <w:uiPriority w:val="99"/>
+    <w:rsid w:val="002475E3"/>
+  </w:style>
 </w:styles>
 </file>
 
@@ -5648,6 +7725,50 @@
     <w:name w:val="label"/>
     <w:basedOn w:val="DefaultParagraphFont"/>
     <w:rsid w:val="00DB3CF9"/>
+  </w:style>
+  <w:style w:type="paragraph" w:styleId="Header">
+    <w:name w:val="header"/>
+    <w:basedOn w:val="Normal"/>
+    <w:link w:val="HeaderChar"/>
+    <w:uiPriority w:val="99"/>
+    <w:unhideWhenUsed/>
+    <w:rsid w:val="002475E3"/>
+    <w:pPr>
+      <w:tabs>
+        <w:tab w:val="center" w:pos="4680"/>
+        <w:tab w:val="right" w:pos="9360"/>
+      </w:tabs>
+      <w:spacing w:after="0" w:line="240" w:lineRule="auto"/>
+    </w:pPr>
+  </w:style>
+  <w:style w:type="character" w:customStyle="1" w:styleId="HeaderChar">
+    <w:name w:val="Header Char"/>
+    <w:basedOn w:val="DefaultParagraphFont"/>
+    <w:link w:val="Header"/>
+    <w:uiPriority w:val="99"/>
+    <w:rsid w:val="002475E3"/>
+  </w:style>
+  <w:style w:type="paragraph" w:styleId="Footer">
+    <w:name w:val="footer"/>
+    <w:basedOn w:val="Normal"/>
+    <w:link w:val="FooterChar"/>
+    <w:uiPriority w:val="99"/>
+    <w:unhideWhenUsed/>
+    <w:rsid w:val="002475E3"/>
+    <w:pPr>
+      <w:tabs>
+        <w:tab w:val="center" w:pos="4680"/>
+        <w:tab w:val="right" w:pos="9360"/>
+      </w:tabs>
+      <w:spacing w:after="0" w:line="240" w:lineRule="auto"/>
+    </w:pPr>
+  </w:style>
+  <w:style w:type="character" w:customStyle="1" w:styleId="FooterChar">
+    <w:name w:val="Footer Char"/>
+    <w:basedOn w:val="DefaultParagraphFont"/>
+    <w:link w:val="Footer"/>
+    <w:uiPriority w:val="99"/>
+    <w:rsid w:val="002475E3"/>
   </w:style>
 </w:styles>
 </file>
@@ -7191,43 +9312,43 @@
     </dgm:pt>
   </dgm:ptLst>
   <dgm:cxnLst>
-    <dgm:cxn modelId="{9DFAB898-7507-4D98-9B23-3423A77A83CD}" type="presOf" srcId="{B2D51EDA-B737-498F-A9F5-A4317E0EBCF9}" destId="{78A873E9-1339-4946-9A60-5571F2DA1EDE}" srcOrd="0" destOrd="0" presId="urn:microsoft.com/office/officeart/2005/8/layout/cycle5"/>
-    <dgm:cxn modelId="{267DC472-CF24-4681-B09C-20319F9C5F84}" type="presOf" srcId="{01077DD7-39EA-43DF-BD75-AD044E4D5917}" destId="{ACB93D15-00F8-4D8C-8175-B7F7F7582196}" srcOrd="0" destOrd="0" presId="urn:microsoft.com/office/officeart/2005/8/layout/cycle5"/>
-    <dgm:cxn modelId="{FDC3BE57-4F27-4358-B286-A1A62F05A9DE}" type="presOf" srcId="{32074876-E230-412A-911E-B87DEB183B6F}" destId="{E7CF2EBA-7D38-42CA-92C0-AE6438D12E91}" srcOrd="0" destOrd="0" presId="urn:microsoft.com/office/officeart/2005/8/layout/cycle5"/>
+    <dgm:cxn modelId="{BC7D0E5A-FD80-45C0-98C7-90BF00624298}" type="presOf" srcId="{32074876-E230-412A-911E-B87DEB183B6F}" destId="{E7CF2EBA-7D38-42CA-92C0-AE6438D12E91}" srcOrd="0" destOrd="0" presId="urn:microsoft.com/office/officeart/2005/8/layout/cycle5"/>
+    <dgm:cxn modelId="{CB6191C5-CEC9-4EFF-9ABF-8AB9781C6901}" type="presOf" srcId="{9F493985-C2C4-4FD3-82CA-8DEFB02171E2}" destId="{97266C65-3406-4F49-A6EC-83D27CE79E5F}" srcOrd="0" destOrd="0" presId="urn:microsoft.com/office/officeart/2005/8/layout/cycle5"/>
+    <dgm:cxn modelId="{4DE29086-944A-4B89-8E08-5271DF34084C}" type="presOf" srcId="{5C5942C5-E7BC-4B53-9DA8-88AB0228F6DC}" destId="{DA10EE5A-E714-486C-ABC8-DB044F132EEC}" srcOrd="0" destOrd="0" presId="urn:microsoft.com/office/officeart/2005/8/layout/cycle5"/>
+    <dgm:cxn modelId="{7D773FE3-BCEB-41EA-9242-25509EB6E747}" type="presOf" srcId="{C44F63CF-A985-46DF-82C8-240669A2B68D}" destId="{8259AC97-E9ED-43BD-8A5D-D0DBB4C70F34}" srcOrd="0" destOrd="0" presId="urn:microsoft.com/office/officeart/2005/8/layout/cycle5"/>
+    <dgm:cxn modelId="{C1D04E92-A44B-4CB2-8BEB-3941D77397CF}" type="presOf" srcId="{A363C7CB-D641-4FC4-9B4B-54DACCC1ECA9}" destId="{A577E049-D61D-4608-A18A-57299E4A0FD4}" srcOrd="0" destOrd="0" presId="urn:microsoft.com/office/officeart/2005/8/layout/cycle5"/>
     <dgm:cxn modelId="{46F0746A-CE20-4C0A-B3D4-2D35A0DC2FEA}" srcId="{BEDC07CE-2707-44F1-B643-FFADD9DBB6E1}" destId="{A363C7CB-D641-4FC4-9B4B-54DACCC1ECA9}" srcOrd="1" destOrd="0" parTransId="{384CDF69-B36D-4F8D-BD96-96E26FDA5A78}" sibTransId="{32074876-E230-412A-911E-B87DEB183B6F}"/>
-    <dgm:cxn modelId="{F553C817-42D6-45D1-AE1A-F24C391521F2}" type="presOf" srcId="{7029C31B-2A5C-4C9A-911A-93B1FA5D462E}" destId="{DF48EE01-8013-4899-A9BE-EEC5CE3B7F00}" srcOrd="0" destOrd="0" presId="urn:microsoft.com/office/officeart/2005/8/layout/cycle5"/>
+    <dgm:cxn modelId="{0CBE7133-BE31-434F-ADD4-07B8D2ACECCC}" type="presOf" srcId="{B2D51EDA-B737-498F-A9F5-A4317E0EBCF9}" destId="{78A873E9-1339-4946-9A60-5571F2DA1EDE}" srcOrd="0" destOrd="0" presId="urn:microsoft.com/office/officeart/2005/8/layout/cycle5"/>
+    <dgm:cxn modelId="{53D429D8-907B-404A-BB90-3FADCAD7A84F}" type="presOf" srcId="{01077DD7-39EA-43DF-BD75-AD044E4D5917}" destId="{ACB93D15-00F8-4D8C-8175-B7F7F7582196}" srcOrd="0" destOrd="0" presId="urn:microsoft.com/office/officeart/2005/8/layout/cycle5"/>
     <dgm:cxn modelId="{1B457948-3C5A-46D3-8A79-CA0B6DD148E4}" srcId="{BEDC07CE-2707-44F1-B643-FFADD9DBB6E1}" destId="{9F493985-C2C4-4FD3-82CA-8DEFB02171E2}" srcOrd="3" destOrd="0" parTransId="{D0D66F88-A388-44C2-A8C7-704674012866}" sibTransId="{A106156C-1267-4742-BBB4-DF428EDE1DCA}"/>
-    <dgm:cxn modelId="{488089BC-1699-4510-B99C-344731530DAA}" type="presOf" srcId="{BEDC07CE-2707-44F1-B643-FFADD9DBB6E1}" destId="{4CCEF618-0F1C-4BB1-8242-5358FB28D986}" srcOrd="0" destOrd="0" presId="urn:microsoft.com/office/officeart/2005/8/layout/cycle5"/>
-    <dgm:cxn modelId="{FE5AA483-4110-40FE-B556-DE95CFA76BB4}" type="presOf" srcId="{C44F63CF-A985-46DF-82C8-240669A2B68D}" destId="{8259AC97-E9ED-43BD-8A5D-D0DBB4C70F34}" srcOrd="0" destOrd="0" presId="urn:microsoft.com/office/officeart/2005/8/layout/cycle5"/>
-    <dgm:cxn modelId="{C5F858B8-8781-425F-8445-19082D3411A7}" type="presOf" srcId="{811CD215-A045-4208-B26E-78B95B5B1894}" destId="{AD57CAF4-FC4F-4A90-81E2-7C797CFEBE1B}" srcOrd="0" destOrd="0" presId="urn:microsoft.com/office/officeart/2005/8/layout/cycle5"/>
-    <dgm:cxn modelId="{01321EF0-CEB8-428A-9B4A-7F8B1D7E357E}" type="presOf" srcId="{A106156C-1267-4742-BBB4-DF428EDE1DCA}" destId="{6B56B917-2E43-4499-B0A3-2A3ED4EFCE5A}" srcOrd="0" destOrd="0" presId="urn:microsoft.com/office/officeart/2005/8/layout/cycle5"/>
-    <dgm:cxn modelId="{5C6B50C6-01E6-446D-B6CF-275A01B81C22}" type="presOf" srcId="{9F493985-C2C4-4FD3-82CA-8DEFB02171E2}" destId="{97266C65-3406-4F49-A6EC-83D27CE79E5F}" srcOrd="0" destOrd="0" presId="urn:microsoft.com/office/officeart/2005/8/layout/cycle5"/>
+    <dgm:cxn modelId="{95B6CA72-6317-4504-BFCC-E39D239E049D}" type="presOf" srcId="{BEDC07CE-2707-44F1-B643-FFADD9DBB6E1}" destId="{4CCEF618-0F1C-4BB1-8242-5358FB28D986}" srcOrd="0" destOrd="0" presId="urn:microsoft.com/office/officeart/2005/8/layout/cycle5"/>
+    <dgm:cxn modelId="{47365095-41B8-4D44-9348-7EFE7139020E}" type="presOf" srcId="{811CD215-A045-4208-B26E-78B95B5B1894}" destId="{AD57CAF4-FC4F-4A90-81E2-7C797CFEBE1B}" srcOrd="0" destOrd="0" presId="urn:microsoft.com/office/officeart/2005/8/layout/cycle5"/>
+    <dgm:cxn modelId="{110A266F-1DE8-4226-A4B0-17F3DF07FE85}" type="presOf" srcId="{7029C31B-2A5C-4C9A-911A-93B1FA5D462E}" destId="{DF48EE01-8013-4899-A9BE-EEC5CE3B7F00}" srcOrd="0" destOrd="0" presId="urn:microsoft.com/office/officeart/2005/8/layout/cycle5"/>
     <dgm:cxn modelId="{9134A342-8E39-4D01-AC8C-BC8FB49F6C8C}" srcId="{BEDC07CE-2707-44F1-B643-FFADD9DBB6E1}" destId="{B2D51EDA-B737-498F-A9F5-A4317E0EBCF9}" srcOrd="4" destOrd="0" parTransId="{0DEBD3FF-C2BE-4D12-9210-9729473E5209}" sibTransId="{5C5942C5-E7BC-4B53-9DA8-88AB0228F6DC}"/>
-    <dgm:cxn modelId="{ADB01CD5-A16C-4272-8DF8-DACB1C105190}" type="presOf" srcId="{A363C7CB-D641-4FC4-9B4B-54DACCC1ECA9}" destId="{A577E049-D61D-4608-A18A-57299E4A0FD4}" srcOrd="0" destOrd="0" presId="urn:microsoft.com/office/officeart/2005/8/layout/cycle5"/>
     <dgm:cxn modelId="{A84ADDEE-0125-4A4B-A361-EE43283E5861}" srcId="{BEDC07CE-2707-44F1-B643-FFADD9DBB6E1}" destId="{01077DD7-39EA-43DF-BD75-AD044E4D5917}" srcOrd="0" destOrd="0" parTransId="{2655EF79-61E3-4EAC-8CB0-769837AA0511}" sibTransId="{811CD215-A045-4208-B26E-78B95B5B1894}"/>
-    <dgm:cxn modelId="{9C7BA2B0-6E13-4342-BEFE-5E4E87A2A894}" type="presOf" srcId="{5C5942C5-E7BC-4B53-9DA8-88AB0228F6DC}" destId="{DA10EE5A-E714-486C-ABC8-DB044F132EEC}" srcOrd="0" destOrd="0" presId="urn:microsoft.com/office/officeart/2005/8/layout/cycle5"/>
+    <dgm:cxn modelId="{E2D006FF-920F-4D15-9104-47586F15ECBF}" type="presOf" srcId="{A106156C-1267-4742-BBB4-DF428EDE1DCA}" destId="{6B56B917-2E43-4499-B0A3-2A3ED4EFCE5A}" srcOrd="0" destOrd="0" presId="urn:microsoft.com/office/officeart/2005/8/layout/cycle5"/>
     <dgm:cxn modelId="{C646AD65-42FC-41D6-83FB-BF4E35DAC61F}" srcId="{BEDC07CE-2707-44F1-B643-FFADD9DBB6E1}" destId="{C44F63CF-A985-46DF-82C8-240669A2B68D}" srcOrd="2" destOrd="0" parTransId="{98ABAC06-0727-4400-A0E2-0AB675592AAB}" sibTransId="{7029C31B-2A5C-4C9A-911A-93B1FA5D462E}"/>
-    <dgm:cxn modelId="{1006421E-F37E-4EB8-8AB2-F6491F4A89C5}" type="presParOf" srcId="{4CCEF618-0F1C-4BB1-8242-5358FB28D986}" destId="{ACB93D15-00F8-4D8C-8175-B7F7F7582196}" srcOrd="0" destOrd="0" presId="urn:microsoft.com/office/officeart/2005/8/layout/cycle5"/>
-    <dgm:cxn modelId="{947D8922-5C8E-4052-90EB-3B0BB47C0855}" type="presParOf" srcId="{4CCEF618-0F1C-4BB1-8242-5358FB28D986}" destId="{9A12B131-18D0-4A62-BF60-3482D945D940}" srcOrd="1" destOrd="0" presId="urn:microsoft.com/office/officeart/2005/8/layout/cycle5"/>
-    <dgm:cxn modelId="{BD2C8862-0216-4F36-9644-894BF30DD425}" type="presParOf" srcId="{4CCEF618-0F1C-4BB1-8242-5358FB28D986}" destId="{AD57CAF4-FC4F-4A90-81E2-7C797CFEBE1B}" srcOrd="2" destOrd="0" presId="urn:microsoft.com/office/officeart/2005/8/layout/cycle5"/>
-    <dgm:cxn modelId="{F4046C72-89ED-48B5-9690-9148DBEE7019}" type="presParOf" srcId="{4CCEF618-0F1C-4BB1-8242-5358FB28D986}" destId="{A577E049-D61D-4608-A18A-57299E4A0FD4}" srcOrd="3" destOrd="0" presId="urn:microsoft.com/office/officeart/2005/8/layout/cycle5"/>
-    <dgm:cxn modelId="{416BC288-5DF0-4226-89A2-9BA59DD74BEA}" type="presParOf" srcId="{4CCEF618-0F1C-4BB1-8242-5358FB28D986}" destId="{ADD19ED9-2CCF-459B-987D-174B8D70D55B}" srcOrd="4" destOrd="0" presId="urn:microsoft.com/office/officeart/2005/8/layout/cycle5"/>
-    <dgm:cxn modelId="{8F1E9B4F-37C2-487B-8E14-32B0E813837D}" type="presParOf" srcId="{4CCEF618-0F1C-4BB1-8242-5358FB28D986}" destId="{E7CF2EBA-7D38-42CA-92C0-AE6438D12E91}" srcOrd="5" destOrd="0" presId="urn:microsoft.com/office/officeart/2005/8/layout/cycle5"/>
-    <dgm:cxn modelId="{C538E27E-4983-4AB2-8C6B-BD791FBDDA75}" type="presParOf" srcId="{4CCEF618-0F1C-4BB1-8242-5358FB28D986}" destId="{8259AC97-E9ED-43BD-8A5D-D0DBB4C70F34}" srcOrd="6" destOrd="0" presId="urn:microsoft.com/office/officeart/2005/8/layout/cycle5"/>
-    <dgm:cxn modelId="{68DEADE3-1C32-4D9F-961D-1787C8833FB0}" type="presParOf" srcId="{4CCEF618-0F1C-4BB1-8242-5358FB28D986}" destId="{7576D024-B163-4E49-B760-646A1C8926D4}" srcOrd="7" destOrd="0" presId="urn:microsoft.com/office/officeart/2005/8/layout/cycle5"/>
-    <dgm:cxn modelId="{AD15CF9A-E1E2-4160-B991-4CA593E9FA43}" type="presParOf" srcId="{4CCEF618-0F1C-4BB1-8242-5358FB28D986}" destId="{DF48EE01-8013-4899-A9BE-EEC5CE3B7F00}" srcOrd="8" destOrd="0" presId="urn:microsoft.com/office/officeart/2005/8/layout/cycle5"/>
-    <dgm:cxn modelId="{3CCF3421-727C-4F2B-A481-5D4777C89127}" type="presParOf" srcId="{4CCEF618-0F1C-4BB1-8242-5358FB28D986}" destId="{97266C65-3406-4F49-A6EC-83D27CE79E5F}" srcOrd="9" destOrd="0" presId="urn:microsoft.com/office/officeart/2005/8/layout/cycle5"/>
-    <dgm:cxn modelId="{89FC9FBA-0180-43CC-A153-8894E4672916}" type="presParOf" srcId="{4CCEF618-0F1C-4BB1-8242-5358FB28D986}" destId="{2F1E782D-188F-4B73-BB2C-63F7DCA825B3}" srcOrd="10" destOrd="0" presId="urn:microsoft.com/office/officeart/2005/8/layout/cycle5"/>
-    <dgm:cxn modelId="{0DA05D61-6E4D-4162-AB20-12D130F2AB8F}" type="presParOf" srcId="{4CCEF618-0F1C-4BB1-8242-5358FB28D986}" destId="{6B56B917-2E43-4499-B0A3-2A3ED4EFCE5A}" srcOrd="11" destOrd="0" presId="urn:microsoft.com/office/officeart/2005/8/layout/cycle5"/>
-    <dgm:cxn modelId="{511F5C6E-D142-4035-9E60-97434EFFDB47}" type="presParOf" srcId="{4CCEF618-0F1C-4BB1-8242-5358FB28D986}" destId="{78A873E9-1339-4946-9A60-5571F2DA1EDE}" srcOrd="12" destOrd="0" presId="urn:microsoft.com/office/officeart/2005/8/layout/cycle5"/>
-    <dgm:cxn modelId="{1C64B7A4-76F8-44B9-9070-0288862D79B2}" type="presParOf" srcId="{4CCEF618-0F1C-4BB1-8242-5358FB28D986}" destId="{6CC1BEA6-A4E2-4AC7-88CF-8DBDBD167B06}" srcOrd="13" destOrd="0" presId="urn:microsoft.com/office/officeart/2005/8/layout/cycle5"/>
-    <dgm:cxn modelId="{0B89EA5D-55AB-4570-94CC-CC449458A105}" type="presParOf" srcId="{4CCEF618-0F1C-4BB1-8242-5358FB28D986}" destId="{DA10EE5A-E714-486C-ABC8-DB044F132EEC}" srcOrd="14" destOrd="0" presId="urn:microsoft.com/office/officeart/2005/8/layout/cycle5"/>
+    <dgm:cxn modelId="{CCBD32F8-ECF3-4007-AFF0-08F97B4FE4BB}" type="presParOf" srcId="{4CCEF618-0F1C-4BB1-8242-5358FB28D986}" destId="{ACB93D15-00F8-4D8C-8175-B7F7F7582196}" srcOrd="0" destOrd="0" presId="urn:microsoft.com/office/officeart/2005/8/layout/cycle5"/>
+    <dgm:cxn modelId="{ED4E95C2-D8C5-4513-919E-EC74577BCAD1}" type="presParOf" srcId="{4CCEF618-0F1C-4BB1-8242-5358FB28D986}" destId="{9A12B131-18D0-4A62-BF60-3482D945D940}" srcOrd="1" destOrd="0" presId="urn:microsoft.com/office/officeart/2005/8/layout/cycle5"/>
+    <dgm:cxn modelId="{288AF489-FA4E-4717-828A-63CC53051D54}" type="presParOf" srcId="{4CCEF618-0F1C-4BB1-8242-5358FB28D986}" destId="{AD57CAF4-FC4F-4A90-81E2-7C797CFEBE1B}" srcOrd="2" destOrd="0" presId="urn:microsoft.com/office/officeart/2005/8/layout/cycle5"/>
+    <dgm:cxn modelId="{959B3A96-721E-448C-A596-42EB64E14ED7}" type="presParOf" srcId="{4CCEF618-0F1C-4BB1-8242-5358FB28D986}" destId="{A577E049-D61D-4608-A18A-57299E4A0FD4}" srcOrd="3" destOrd="0" presId="urn:microsoft.com/office/officeart/2005/8/layout/cycle5"/>
+    <dgm:cxn modelId="{7AA6CD47-ED16-401A-B854-F927CB37C9B2}" type="presParOf" srcId="{4CCEF618-0F1C-4BB1-8242-5358FB28D986}" destId="{ADD19ED9-2CCF-459B-987D-174B8D70D55B}" srcOrd="4" destOrd="0" presId="urn:microsoft.com/office/officeart/2005/8/layout/cycle5"/>
+    <dgm:cxn modelId="{2CA3B937-E4FB-4FC8-BA9F-3817F28D1A1E}" type="presParOf" srcId="{4CCEF618-0F1C-4BB1-8242-5358FB28D986}" destId="{E7CF2EBA-7D38-42CA-92C0-AE6438D12E91}" srcOrd="5" destOrd="0" presId="urn:microsoft.com/office/officeart/2005/8/layout/cycle5"/>
+    <dgm:cxn modelId="{7852D43E-DD69-4965-BC8A-6BE9D64ACA7F}" type="presParOf" srcId="{4CCEF618-0F1C-4BB1-8242-5358FB28D986}" destId="{8259AC97-E9ED-43BD-8A5D-D0DBB4C70F34}" srcOrd="6" destOrd="0" presId="urn:microsoft.com/office/officeart/2005/8/layout/cycle5"/>
+    <dgm:cxn modelId="{D10CC5AC-01CE-4C64-9CFB-82139A8F070F}" type="presParOf" srcId="{4CCEF618-0F1C-4BB1-8242-5358FB28D986}" destId="{7576D024-B163-4E49-B760-646A1C8926D4}" srcOrd="7" destOrd="0" presId="urn:microsoft.com/office/officeart/2005/8/layout/cycle5"/>
+    <dgm:cxn modelId="{9BC2D161-329D-4DE8-941D-7DE632FA6916}" type="presParOf" srcId="{4CCEF618-0F1C-4BB1-8242-5358FB28D986}" destId="{DF48EE01-8013-4899-A9BE-EEC5CE3B7F00}" srcOrd="8" destOrd="0" presId="urn:microsoft.com/office/officeart/2005/8/layout/cycle5"/>
+    <dgm:cxn modelId="{E2F6866B-1CF0-4602-94C8-092780CA67AE}" type="presParOf" srcId="{4CCEF618-0F1C-4BB1-8242-5358FB28D986}" destId="{97266C65-3406-4F49-A6EC-83D27CE79E5F}" srcOrd="9" destOrd="0" presId="urn:microsoft.com/office/officeart/2005/8/layout/cycle5"/>
+    <dgm:cxn modelId="{F9703D20-1CFE-4681-9C0F-B62B7191A55D}" type="presParOf" srcId="{4CCEF618-0F1C-4BB1-8242-5358FB28D986}" destId="{2F1E782D-188F-4B73-BB2C-63F7DCA825B3}" srcOrd="10" destOrd="0" presId="urn:microsoft.com/office/officeart/2005/8/layout/cycle5"/>
+    <dgm:cxn modelId="{DA603D5E-2A7F-4235-8D78-9343434A2937}" type="presParOf" srcId="{4CCEF618-0F1C-4BB1-8242-5358FB28D986}" destId="{6B56B917-2E43-4499-B0A3-2A3ED4EFCE5A}" srcOrd="11" destOrd="0" presId="urn:microsoft.com/office/officeart/2005/8/layout/cycle5"/>
+    <dgm:cxn modelId="{0D441C93-9A36-4F68-AD71-163A35870FDC}" type="presParOf" srcId="{4CCEF618-0F1C-4BB1-8242-5358FB28D986}" destId="{78A873E9-1339-4946-9A60-5571F2DA1EDE}" srcOrd="12" destOrd="0" presId="urn:microsoft.com/office/officeart/2005/8/layout/cycle5"/>
+    <dgm:cxn modelId="{1EAC0532-FD92-460F-AEDD-49EF21554877}" type="presParOf" srcId="{4CCEF618-0F1C-4BB1-8242-5358FB28D986}" destId="{6CC1BEA6-A4E2-4AC7-88CF-8DBDBD167B06}" srcOrd="13" destOrd="0" presId="urn:microsoft.com/office/officeart/2005/8/layout/cycle5"/>
+    <dgm:cxn modelId="{710BB732-CD9F-4714-9E62-F4E2495418F2}" type="presParOf" srcId="{4CCEF618-0F1C-4BB1-8242-5358FB28D986}" destId="{DA10EE5A-E714-486C-ABC8-DB044F132EEC}" srcOrd="14" destOrd="0" presId="urn:microsoft.com/office/officeart/2005/8/layout/cycle5"/>
   </dgm:cxnLst>
   <dgm:bg/>
   <dgm:whole/>
   <dgm:extLst>
     <a:ext uri="http://schemas.microsoft.com/office/drawing/2008/diagram">
-      <dsp:dataModelExt xmlns:dsp="http://schemas.microsoft.com/office/drawing/2008/diagram" relId="rId19" minVer="http://schemas.openxmlformats.org/drawingml/2006/diagram"/>
+      <dsp:dataModelExt xmlns:dsp="http://schemas.microsoft.com/office/drawing/2008/diagram" relId="rId22" minVer="http://schemas.openxmlformats.org/drawingml/2006/diagram"/>
     </a:ext>
   </dgm:extLst>
 </dgm:dataModel>

</xml_diff>